<commit_message>
Updated Word, LaTeX and PowerPoint Templates and  guidelines.
</commit_message>
<xml_diff>
--- a/word/RINGMeeting_template.docx
+++ b/word/RINGMeeting_template.docx
@@ -1,6 +1,6 @@
 
 <file path=word/document.xml><?xml version="1.0" encoding="utf-8"?>
-<w:document xmlns:wpc="http://schemas.microsoft.com/office/word/2010/wordprocessingCanvas" xmlns:mc="http://schemas.openxmlformats.org/markup-compatibility/2006" xmlns:o="urn:schemas-microsoft-com:office:office" xmlns:r="http://schemas.openxmlformats.org/officeDocument/2006/relationships" xmlns:m="http://schemas.openxmlformats.org/officeDocument/2006/math" xmlns:v="urn:schemas-microsoft-com:vml" xmlns:wp14="http://schemas.microsoft.com/office/word/2010/wordprocessingDrawing" xmlns:wp="http://schemas.openxmlformats.org/drawingml/2006/wordprocessingDrawing" xmlns:w10="urn:schemas-microsoft-com:office:word" xmlns:w="http://schemas.openxmlformats.org/wordprocessingml/2006/main" xmlns:w14="http://schemas.microsoft.com/office/word/2010/wordml" xmlns:w15="http://schemas.microsoft.com/office/word/2012/wordml" xmlns:wpg="http://schemas.microsoft.com/office/word/2010/wordprocessingGroup" xmlns:wpi="http://schemas.microsoft.com/office/word/2010/wordprocessingInk" xmlns:wne="http://schemas.microsoft.com/office/word/2006/wordml" xmlns:wps="http://schemas.microsoft.com/office/word/2010/wordprocessingShape" mc:Ignorable="w14 w15 wp14">
+<w:document xmlns:wpc="http://schemas.microsoft.com/office/word/2010/wordprocessingCanvas" xmlns:cx="http://schemas.microsoft.com/office/drawing/2014/chartex" xmlns:cx1="http://schemas.microsoft.com/office/drawing/2015/9/8/chartex" xmlns:cx2="http://schemas.microsoft.com/office/drawing/2015/10/21/chartex" xmlns:cx3="http://schemas.microsoft.com/office/drawing/2016/5/9/chartex" xmlns:cx4="http://schemas.microsoft.com/office/drawing/2016/5/10/chartex" xmlns:cx5="http://schemas.microsoft.com/office/drawing/2016/5/11/chartex" xmlns:cx6="http://schemas.microsoft.com/office/drawing/2016/5/12/chartex" xmlns:cx7="http://schemas.microsoft.com/office/drawing/2016/5/13/chartex" xmlns:cx8="http://schemas.microsoft.com/office/drawing/2016/5/14/chartex" xmlns:mc="http://schemas.openxmlformats.org/markup-compatibility/2006" xmlns:aink="http://schemas.microsoft.com/office/drawing/2016/ink" xmlns:am3d="http://schemas.microsoft.com/office/drawing/2017/model3d" xmlns:o="urn:schemas-microsoft-com:office:office" xmlns:oel="http://schemas.microsoft.com/office/2019/extlst" xmlns:r="http://schemas.openxmlformats.org/officeDocument/2006/relationships" xmlns:m="http://schemas.openxmlformats.org/officeDocument/2006/math" xmlns:v="urn:schemas-microsoft-com:vml" xmlns:wp14="http://schemas.microsoft.com/office/word/2010/wordprocessingDrawing" xmlns:wp="http://schemas.openxmlformats.org/drawingml/2006/wordprocessingDrawing" xmlns:w10="urn:schemas-microsoft-com:office:word" xmlns:w="http://schemas.openxmlformats.org/wordprocessingml/2006/main" xmlns:w14="http://schemas.microsoft.com/office/word/2010/wordml" xmlns:w15="http://schemas.microsoft.com/office/word/2012/wordml" xmlns:w16cex="http://schemas.microsoft.com/office/word/2018/wordml/cex" xmlns:w16cid="http://schemas.microsoft.com/office/word/2016/wordml/cid" xmlns:w16="http://schemas.microsoft.com/office/word/2018/wordml" xmlns:w16du="http://schemas.microsoft.com/office/word/2023/wordml/word16du" xmlns:w16sdtdh="http://schemas.microsoft.com/office/word/2020/wordml/sdtdatahash" xmlns:w16sdtfl="http://schemas.microsoft.com/office/word/2024/wordml/sdtformatlock" xmlns:w16se="http://schemas.microsoft.com/office/word/2015/wordml/symex" xmlns:wpg="http://schemas.microsoft.com/office/word/2010/wordprocessingGroup" xmlns:wpi="http://schemas.microsoft.com/office/word/2010/wordprocessingInk" xmlns:wne="http://schemas.microsoft.com/office/word/2006/wordml" xmlns:wps="http://schemas.microsoft.com/office/word/2010/wordprocessingShape" mc:Ignorable="w14 w15 w16se w16cid w16 w16cex w16sdtdh w16sdtfl w16du wp14">
   <w:background w:color="FFFFFF"/>
   <w:body>
     <w:p>
@@ -51,13 +51,13 @@
         <w:t xml:space="preserve">1, revised </w:t>
       </w:r>
       <w:r>
-        <w:t>Jan</w:t>
-      </w:r>
-      <w:r>
-        <w:t xml:space="preserve"> 202</w:t>
-      </w:r>
-      <w:r>
-        <w:t>5</w:t>
+        <w:t xml:space="preserve">Feb </w:t>
+      </w:r>
+      <w:r>
+        <w:t>202</w:t>
+      </w:r>
+      <w:r>
+        <w:t>6</w:t>
       </w:r>
       <w:r>
         <w:t>).</w:t>
@@ -130,16 +130,8 @@
         <w:rPr>
           <w:vertAlign w:val="superscript"/>
         </w:rPr>
-        <w:t>1</w:t>
-      </w:r>
-      <w:proofErr w:type="gramStart"/>
-      <w:r>
-        <w:rPr>
-          <w:vertAlign w:val="superscript"/>
-        </w:rPr>
-        <w:t>,2</w:t>
-      </w:r>
-      <w:proofErr w:type="gramEnd"/>
+        <w:t>1,2</w:t>
+      </w:r>
     </w:p>
     <w:p>
       <w:pPr>
@@ -168,49 +160,58 @@
           <w:rStyle w:val="RINGAffiliationCar"/>
           <w:lang w:val="fr-FR"/>
         </w:rPr>
-        <w:t>R</w:t>
+        <w:t>Université de Lorraine</w:t>
       </w:r>
       <w:r>
         <w:rPr>
           <w:rStyle w:val="RINGAffiliationCar"/>
           <w:lang w:val="fr-FR"/>
         </w:rPr>
-        <w:t>ING</w:t>
+        <w:t xml:space="preserve">, </w:t>
       </w:r>
       <w:r>
         <w:rPr>
           <w:rStyle w:val="RINGAffiliationCar"/>
           <w:lang w:val="fr-FR"/>
         </w:rPr>
-        <w:t xml:space="preserve">, </w:t>
+        <w:t>CNRS</w:t>
       </w:r>
       <w:r>
         <w:rPr>
           <w:rStyle w:val="RINGAffiliationCar"/>
           <w:lang w:val="fr-FR"/>
         </w:rPr>
-        <w:t>GeoRessources / ENSG, Université de Lorraine / CNRS</w:t>
-      </w:r>
+        <w:t xml:space="preserve">, </w:t>
+      </w:r>
+      <w:proofErr w:type="spellStart"/>
       <w:r>
         <w:rPr>
           <w:rStyle w:val="RINGAffiliationCar"/>
           <w:lang w:val="fr-FR"/>
         </w:rPr>
-        <w:t>,</w:t>
-      </w:r>
+        <w:t>GeoRessources</w:t>
+      </w:r>
+      <w:proofErr w:type="spellEnd"/>
       <w:r>
         <w:rPr>
           <w:rStyle w:val="RINGAffiliationCar"/>
           <w:lang w:val="fr-FR"/>
         </w:rPr>
-        <w:t xml:space="preserve"> F-54000 France</w:t>
+        <w:t>,</w:t>
       </w:r>
       <w:r>
         <w:rPr>
           <w:rStyle w:val="RINGAffiliationCar"/>
           <w:lang w:val="fr-FR"/>
         </w:rPr>
-        <w:t>.</w:t>
+        <w:t xml:space="preserve"> F-54000 </w:t>
+      </w:r>
+      <w:r>
+        <w:rPr>
+          <w:rStyle w:val="RINGAffiliationCar"/>
+          <w:lang w:val="fr-FR"/>
+        </w:rPr>
+        <w:t>Nancy</w:t>
       </w:r>
     </w:p>
     <w:p>
@@ -234,40 +235,37 @@
         <w:rPr>
           <w:rStyle w:val="RINGAffiliationCar"/>
         </w:rPr>
-        <w:t xml:space="preserve">Team, </w:t>
+        <w:t>Organization</w:t>
       </w:r>
       <w:r>
         <w:rPr>
           <w:rStyle w:val="RINGAffiliationCar"/>
         </w:rPr>
-        <w:t>Lab</w:t>
+        <w:t xml:space="preserve">, </w:t>
       </w:r>
       <w:r>
         <w:rPr>
           <w:rStyle w:val="RINGAffiliationCar"/>
         </w:rPr>
-        <w:t>oratory</w:t>
+        <w:t>Department,</w:t>
       </w:r>
       <w:r>
         <w:rPr>
           <w:rStyle w:val="RINGAffiliationCar"/>
         </w:rPr>
-        <w:t xml:space="preserve">, </w:t>
+        <w:t xml:space="preserve"> Zip </w:t>
       </w:r>
       <w:r>
         <w:rPr>
           <w:rStyle w:val="RINGAffiliationCar"/>
         </w:rPr>
-        <w:t>Organization</w:t>
+        <w:t>c</w:t>
       </w:r>
       <w:r>
         <w:rPr>
           <w:rStyle w:val="RINGAffiliationCar"/>
         </w:rPr>
-        <w:t>, Zip Code, Country</w:t>
-      </w:r>
-      <w:r>
-        <w:t>.</w:t>
+        <w:t>ode, Country</w:t>
       </w:r>
     </w:p>
     <w:p>
@@ -286,7 +284,7 @@
         <w:t xml:space="preserve"> 202</w:t>
       </w:r>
       <w:r>
-        <w:t>X</w:t>
+        <w:t>6</w:t>
       </w:r>
     </w:p>
     <w:p>
@@ -474,40 +472,116 @@
     </w:p>
     <w:p>
       <w:r>
-        <w:t xml:space="preserve">The introduction should present the problem addressed </w:t>
-      </w:r>
-      <w:r>
-        <w:t xml:space="preserve">to a general audience of geoscientists. A few general sentences can set the </w:t>
-      </w:r>
-      <w:r>
-        <w:t>context</w:t>
-      </w:r>
-      <w:r>
-        <w:t xml:space="preserve"> and explain the importance of the work in laym</w:t>
-      </w:r>
-      <w:r>
-        <w:t>a</w:t>
-      </w:r>
-      <w:r>
-        <w:t>n terms</w:t>
-      </w:r>
-      <w:r>
-        <w:t xml:space="preserve">. Using references is paramount to support some </w:t>
-      </w:r>
-      <w:r>
-        <w:t>of these statements and to set the scene</w:t>
-      </w:r>
-      <w:r>
-        <w:t xml:space="preserve">. </w:t>
-      </w:r>
-      <w:r>
-        <w:t>Then</w:t>
-      </w:r>
-      <w:r>
-        <w:t>,</w:t>
-      </w:r>
-      <w:r>
-        <w:t xml:space="preserve"> you can move on to the objectives, questions or challenges that are addressed in the paper. The end of the introduction can typically highlight in simple words the main methodological contributions (Section 1), the specifics of the application (Section 2) and the main discussion elements (Section 3)</w:t>
+        <w:t xml:space="preserve">The introduction should present the problem and the main contributions of the paper to a general audience of </w:t>
+      </w:r>
+      <w:proofErr w:type="gramStart"/>
+      <w:r>
+        <w:t>geoscientists</w:t>
+      </w:r>
+      <w:proofErr w:type="gramEnd"/>
+      <w:r>
+        <w:t xml:space="preserve"> and engineers. Writing a good introduction calls for already having a clear view of the contributions (what is new) in the </w:t>
+      </w:r>
+      <w:proofErr w:type="gramStart"/>
+      <w:r>
+        <w:t>paper, and</w:t>
+      </w:r>
+      <w:proofErr w:type="gramEnd"/>
+      <w:r>
+        <w:t xml:space="preserve"> contextualizing these contributions using references. Students writing their first paper may fall into the trap of trying to describe everything they have learned in the introduction (and in the paper</w:t>
+      </w:r>
+      <w:proofErr w:type="gramStart"/>
+      <w:r>
+        <w:t>), and</w:t>
+      </w:r>
+      <w:proofErr w:type="gramEnd"/>
+      <w:r>
+        <w:t xml:space="preserve"> mention many general aspects that have limited connections to the paper's contributions. Using general references to good review papers or textbooks in the first sentences of the introduction is often a good way to start gently and then quickly orient the reader towards the main point of the work contextualized with more detailed and specific references. Said differently, a paper is not an encyclopedia and cannot explain all the prior knowledge in detail. Rather, it aims at present what is </w:t>
+      </w:r>
+      <w:proofErr w:type="gramStart"/>
+      <w:r>
+        <w:t>new, and</w:t>
+      </w:r>
+      <w:proofErr w:type="gramEnd"/>
+      <w:r>
+        <w:t xml:space="preserve"> just need</w:t>
+      </w:r>
+      <w:r>
+        <w:t>s</w:t>
+      </w:r>
+      <w:r>
+        <w:t xml:space="preserve"> references to contextualize and explain the problem and the novel aspects. </w:t>
+      </w:r>
+    </w:p>
+    <w:p/>
+    <w:p>
+      <w:r>
+        <w:t xml:space="preserve">After setting the landscape, the introduction should quickly highlight the main research gaps and </w:t>
+      </w:r>
+      <w:proofErr w:type="gramStart"/>
+      <w:r>
+        <w:t>questions, and</w:t>
+      </w:r>
+      <w:proofErr w:type="gramEnd"/>
+      <w:r>
+        <w:t xml:space="preserve"> summarize in simple terms the main methodological contributions of the paper (Section </w:t>
+      </w:r>
+      <w:r>
+        <w:fldChar w:fldCharType="begin"/>
+      </w:r>
+      <w:r>
+        <w:instrText xml:space="preserve"> REF _Ref221719873 \r \h </w:instrText>
+      </w:r>
+      <w:r>
+        <w:fldChar w:fldCharType="separate"/>
+      </w:r>
+      <w:r>
+        <w:t>1</w:t>
+      </w:r>
+      <w:r>
+        <w:fldChar w:fldCharType="end"/>
+      </w:r>
+      <w:r>
+        <w:t>). It should also briefly announce the specifics of the application or validation approach (Section</w:t>
+      </w:r>
+      <w:r>
+        <w:t xml:space="preserve"> </w:t>
+      </w:r>
+      <w:r>
+        <w:fldChar w:fldCharType="begin"/>
+      </w:r>
+      <w:r>
+        <w:instrText xml:space="preserve"> REF _Ref221719896 \r \h </w:instrText>
+      </w:r>
+      <w:r>
+        <w:fldChar w:fldCharType="separate"/>
+      </w:r>
+      <w:r>
+        <w:t>2</w:t>
+      </w:r>
+      <w:r>
+        <w:fldChar w:fldCharType="end"/>
+      </w:r>
+      <w:r>
+        <w:t xml:space="preserve">) and the main discussion elements (Section </w:t>
+      </w:r>
+      <w:r>
+        <w:fldChar w:fldCharType="begin"/>
+      </w:r>
+      <w:r>
+        <w:instrText xml:space="preserve"> REF _Ref221719911 \r \h </w:instrText>
+      </w:r>
+      <w:r>
+        <w:fldChar w:fldCharType="separate"/>
+      </w:r>
+      <w:r>
+        <w:t>3</w:t>
+      </w:r>
+      <w:r>
+        <w:fldChar w:fldCharType="end"/>
+      </w:r>
+      <w:r>
+        <w:t>)</w:t>
       </w:r>
       <w:r>
         <w:rPr>
@@ -518,26 +592,35 @@
       <w:r>
         <w:t>.</w:t>
       </w:r>
-      <w:r>
-        <w:t xml:space="preserve"> </w:t>
-      </w:r>
-    </w:p>
-    <w:p>
-      <w:r>
-        <w:t>The</w:t>
-      </w:r>
-      <w:r>
-        <w:t xml:space="preserve"> introduction should help both the person new to the field and the expert to quickly learn and identify the interesting aspects of your paper. Writing a good introduction calls for already having a clear view of the contributions (what is new) in the paper, and contextualizing using references. Students writing their first paper may fall into the trap of trying to describe everything they have learned in the introduction (and in the paper). </w:t>
-      </w:r>
-      <w:r>
-        <w:t xml:space="preserve">A good literature read (maybe starting with some good review papers) is essential to avoid this stumbling block and quickly get to the main point of the work. A paper is not an encyclopedia and cannot explain all the prior knowledge in detail. Therefore, it is best to know a bit about the readership of your paper. The key to a good introduction is to tell a compelling story which goes for the general motivation / problem to your contributions using the appropriate level of detail. As a general rule, the level of detail in an introduction should be the same as in paper abstracts, or even more synthetic. In general, the length of an introduction varies between a half </w:t>
-      </w:r>
+    </w:p>
+    <w:p>
       <w:r>
         <w:lastRenderedPageBreak/>
-        <w:t>page and two pages. It can help in many cases to support the introduction with a figure to express the problem and bulk idea / workflow of the paper</w:t>
-      </w:r>
-      <w:r>
-        <w:t xml:space="preserve">. </w:t>
+        <w:t xml:space="preserve">The key to a good introduction is to tell a compelling and short story using </w:t>
+      </w:r>
+      <w:proofErr w:type="gramStart"/>
+      <w:r>
+        <w:t>a logical</w:t>
+      </w:r>
+      <w:proofErr w:type="gramEnd"/>
+      <w:r>
+        <w:t xml:space="preserve"> progression which goes for the general motivation / problem to your detailed research questions and gaps to summarize the paper's contributions in simple but precise terms. </w:t>
+      </w:r>
+      <w:proofErr w:type="gramStart"/>
+      <w:r>
+        <w:t>As a general rule</w:t>
+      </w:r>
+      <w:proofErr w:type="gramEnd"/>
+      <w:r>
+        <w:t xml:space="preserve">, the level of detail in an introduction should be about the same as that of the abstracts of the cited papers. In general, the length of an introduction varies between </w:t>
+      </w:r>
+      <w:proofErr w:type="gramStart"/>
+      <w:r>
+        <w:t>a half page</w:t>
+      </w:r>
+      <w:proofErr w:type="gramEnd"/>
+      <w:r>
+        <w:t xml:space="preserve"> and two pages. It can help in many cases to support the introduction with a figure to express the problem and bulk idea / workflow of the paper. </w:t>
       </w:r>
     </w:p>
     <w:p>
@@ -692,12 +775,22 @@
       <w:pPr>
         <w:pStyle w:val="Titre1"/>
       </w:pPr>
+      <w:bookmarkStart w:id="0" w:name="_Ref221719873"/>
       <w:r>
         <w:t>Material and methods</w:t>
       </w:r>
       <w:r>
         <w:t xml:space="preserve"> [Section title can be changed to be more specific]</w:t>
       </w:r>
+      <w:bookmarkEnd w:id="0"/>
+    </w:p>
+    <w:p>
+      <w:pPr>
+        <w:pStyle w:val="Titre2"/>
+      </w:pPr>
+      <w:r>
+        <w:t xml:space="preserve">Explaining your method </w:t>
+      </w:r>
     </w:p>
     <w:p>
       <w:r>
@@ -811,6 +904,110 @@
     </w:p>
     <w:p>
       <w:r>
+        <w:t>A common pitfall in methodological papers is to jump into detailed descriptions about how the problem is solved before properly explain</w:t>
+      </w:r>
+      <w:r>
+        <w:t xml:space="preserve">ing the problem itself. A good practice </w:t>
+      </w:r>
+      <w:r>
+        <w:t>to avoid</w:t>
+      </w:r>
+      <w:r>
+        <w:t xml:space="preserve"> this issue it to </w:t>
+      </w:r>
+      <w:r>
+        <w:rPr>
+          <w:b/>
+          <w:bCs/>
+        </w:rPr>
+        <w:t xml:space="preserve">make sure you explain </w:t>
+      </w:r>
+      <w:r>
+        <w:rPr>
+          <w:b/>
+          <w:bCs/>
+        </w:rPr>
+        <w:t>the ‘</w:t>
+      </w:r>
+      <w:r>
+        <w:rPr>
+          <w:b/>
+          <w:bCs/>
+        </w:rPr>
+        <w:t>why</w:t>
+      </w:r>
+      <w:r>
+        <w:rPr>
+          <w:b/>
+          <w:bCs/>
+        </w:rPr>
+        <w:t>’</w:t>
+      </w:r>
+      <w:r>
+        <w:rPr>
+          <w:b/>
+          <w:bCs/>
+        </w:rPr>
+        <w:t xml:space="preserve"> and </w:t>
+      </w:r>
+      <w:r>
+        <w:rPr>
+          <w:b/>
+          <w:bCs/>
+        </w:rPr>
+        <w:t>the ‘</w:t>
+      </w:r>
+      <w:r>
+        <w:rPr>
+          <w:b/>
+          <w:bCs/>
+        </w:rPr>
+        <w:t>what</w:t>
+      </w:r>
+      <w:r>
+        <w:rPr>
+          <w:b/>
+          <w:bCs/>
+        </w:rPr>
+        <w:t>’</w:t>
+      </w:r>
+      <w:r>
+        <w:rPr>
+          <w:b/>
+          <w:bCs/>
+        </w:rPr>
+        <w:t xml:space="preserve"> before explaining </w:t>
+      </w:r>
+      <w:r>
+        <w:rPr>
+          <w:b/>
+          <w:bCs/>
+        </w:rPr>
+        <w:t>the ‘</w:t>
+      </w:r>
+      <w:r>
+        <w:rPr>
+          <w:b/>
+          <w:bCs/>
+        </w:rPr>
+        <w:t>how</w:t>
+      </w:r>
+      <w:r>
+        <w:rPr>
+          <w:b/>
+          <w:bCs/>
+        </w:rPr>
+        <w:t>’</w:t>
+      </w:r>
+      <w:r>
+        <w:t>.</w:t>
+      </w:r>
+      <w:r>
+        <w:t xml:space="preserve"> </w:t>
+      </w:r>
+    </w:p>
+    <w:p>
+      <w:r>
         <w:t>Beware that all m</w:t>
       </w:r>
       <w:r>
@@ -850,7 +1047,19 @@
         <w:t>lsewhere, please try to avoid the first person to focus on facts</w:t>
       </w:r>
       <w:r>
-        <w:t>, unless in sentences where “we” means the reader and the authors, e.g., “We will now discuss the implications of theorem 3”</w:t>
+        <w:t xml:space="preserve">, unless in sentences where “we” means the reader and the authors, e.g., “We </w:t>
+      </w:r>
+      <w:r>
+        <w:t>see that T</w:t>
+      </w:r>
+      <w:r>
+        <w:t>heorem 3</w:t>
+      </w:r>
+      <w:r>
+        <w:t xml:space="preserve"> provides a robust basis for […]</w:t>
+      </w:r>
+      <w:r>
+        <w:t>”</w:t>
       </w:r>
       <w:r>
         <w:t>)</w:t>
@@ -862,22 +1071,45 @@
         <w:t xml:space="preserve"> </w:t>
       </w:r>
       <w:r>
-        <w:t xml:space="preserve">Nonetheless, </w:t>
-      </w:r>
-      <w:r>
-        <w:t>extensive</w:t>
-      </w:r>
-      <w:r>
-        <w:t xml:space="preserve"> discussions on model assumptions should, in general, be avoided in </w:t>
-      </w:r>
-      <w:r>
-        <w:t>the methods</w:t>
+        <w:t xml:space="preserve">The limitations and implications </w:t>
+      </w:r>
+      <w:proofErr w:type="gramStart"/>
+      <w:r>
+        <w:t>relative</w:t>
+      </w:r>
+      <w:proofErr w:type="gramEnd"/>
+      <w:r>
+        <w:t xml:space="preserve"> to</w:t>
+      </w:r>
+      <w:r>
+        <w:t xml:space="preserve"> model assumptions </w:t>
+      </w:r>
+      <w:r>
+        <w:t xml:space="preserve">should not be addressed in the </w:t>
+      </w:r>
+      <w:r>
+        <w:t>methods</w:t>
       </w:r>
       <w:r>
         <w:t xml:space="preserve"> section</w:t>
       </w:r>
       <w:r>
-        <w:t xml:space="preserve"> but rather postponed to Section </w:t>
+        <w:t>,</w:t>
+      </w:r>
+      <w:r>
+        <w:t xml:space="preserve"> but rather postponed to </w:t>
+      </w:r>
+      <w:r>
+        <w:t>the discussion (</w:t>
+      </w:r>
+      <w:r>
+        <w:t>Sect</w:t>
+      </w:r>
+      <w:r>
+        <w:t>.</w:t>
+      </w:r>
+      <w:r>
+        <w:t xml:space="preserve"> </w:t>
       </w:r>
       <w:r>
         <w:fldChar w:fldCharType="begin"/>
@@ -893,6 +1125,9 @@
       </w:r>
       <w:r>
         <w:fldChar w:fldCharType="end"/>
+      </w:r>
+      <w:r>
+        <w:t>)</w:t>
       </w:r>
       <w:r>
         <w:t>.</w:t>
@@ -1082,16 +1317,8 @@
         <w:rPr>
           <w:smallCaps/>
         </w:rPr>
-        <w:t xml:space="preserve"> </w:t>
-      </w:r>
-      <w:proofErr w:type="spellStart"/>
-      <w:r>
-        <w:rPr>
-          <w:smallCaps/>
-        </w:rPr>
-        <w:t>Rainaud</w:t>
-      </w:r>
-      <w:proofErr w:type="spellEnd"/>
+        <w:t xml:space="preserve"> Rainaud</w:t>
+      </w:r>
       <w:r>
         <w:t xml:space="preserve"> </w:t>
       </w:r>
@@ -1266,129 +1493,15 @@
         <w:t xml:space="preserve">to </w:t>
       </w:r>
       <w:r>
-        <w:t xml:space="preserve">help the reader distinguish between example illustrating a general statement or some more specific contributions. </w:t>
-      </w:r>
-    </w:p>
-    <w:p>
-      <w:pPr>
-        <w:pStyle w:val="RINGSubSubSection"/>
-      </w:pPr>
-      <w:r>
-        <w:t>Configuring Zotero</w:t>
-      </w:r>
-      <w:r>
-        <w:t xml:space="preserve"> to use </w:t>
-      </w:r>
-      <w:r>
-        <w:t>the RING202</w:t>
-      </w:r>
-      <w:r>
-        <w:t>3</w:t>
-      </w:r>
-      <w:r>
-        <w:t xml:space="preserve"> style</w:t>
-      </w:r>
-      <w:bookmarkStart w:id="0" w:name="_GoBack"/>
-      <w:bookmarkEnd w:id="0"/>
-    </w:p>
-    <w:p>
-      <w:pPr>
-        <w:pStyle w:val="GocadNormal"/>
-      </w:pPr>
-      <w:r>
-        <w:t xml:space="preserve">In Zotero, you can go to </w:t>
-      </w:r>
-      <w:r>
-        <w:rPr>
-          <w:b/>
-          <w:bCs/>
-        </w:rPr>
-        <w:t>Edit / Preferences</w:t>
-      </w:r>
-      <w:r>
-        <w:t xml:space="preserve"> and then select the Citation tab</w:t>
-      </w:r>
-      <w:r>
-        <w:t xml:space="preserve">. From there, you can </w:t>
-      </w:r>
-      <w:r>
-        <w:t>l</w:t>
-      </w:r>
-      <w:r>
-        <w:t xml:space="preserve">oad the </w:t>
-      </w:r>
-      <w:r>
-        <w:t>RING202</w:t>
-      </w:r>
-      <w:r>
-        <w:t>3</w:t>
-      </w:r>
-      <w:r>
-        <w:t>.c</w:t>
-      </w:r>
-      <w:r>
-        <w:t>s</w:t>
-      </w:r>
-      <w:r>
-        <w:t>l</w:t>
-      </w:r>
-      <w:r>
-        <w:t xml:space="preserve"> </w:t>
-      </w:r>
-      <w:r>
-        <w:t xml:space="preserve">citation style, which can then be selected in the Document preferences of the Word Zotero plugin </w:t>
-      </w:r>
-      <w:r>
-        <w:t>m</w:t>
-      </w:r>
-      <w:r>
-        <w:t>enu.</w:t>
-      </w:r>
-      <w:r>
-        <w:t xml:space="preserve"> </w:t>
-      </w:r>
-      <w:r>
-        <w:t xml:space="preserve">Further documentation is available from the Zotero Word plugin. </w:t>
-      </w:r>
-    </w:p>
-    <w:p>
-      <w:pPr>
-        <w:pStyle w:val="RINGSubSubSection"/>
-      </w:pPr>
-      <w:r>
-        <w:t>Configuring Mendeley</w:t>
-      </w:r>
-      <w:r>
-        <w:t xml:space="preserve"> to use </w:t>
-      </w:r>
-      <w:r>
-        <w:t>the RING202</w:t>
-      </w:r>
-      <w:r>
-        <w:t>3</w:t>
-      </w:r>
-      <w:r>
-        <w:t xml:space="preserve"> </w:t>
-      </w:r>
-      <w:r>
-        <w:t>style</w:t>
-      </w:r>
-    </w:p>
-    <w:p>
-      <w:pPr>
-        <w:pStyle w:val="GocadNormal"/>
-      </w:pPr>
-      <w:r>
-        <w:t xml:space="preserve">Please refer to the Mendeley and Mendeley Word plugin documentation. </w:t>
-      </w:r>
-    </w:p>
-    <w:p>
-      <w:pPr>
-        <w:pStyle w:val="Titre2"/>
-      </w:pPr>
-      <w:r>
-        <w:lastRenderedPageBreak/>
-        <w:t>Figures</w:t>
+        <w:t xml:space="preserve">help the reader distinguish between </w:t>
+      </w:r>
+      <w:proofErr w:type="gramStart"/>
+      <w:r>
+        <w:t>example</w:t>
+      </w:r>
+      <w:proofErr w:type="gramEnd"/>
+      <w:r>
+        <w:t xml:space="preserve"> illustrating a general statement or some more specific contributions. </w:t>
       </w:r>
     </w:p>
     <w:p>
@@ -1400,8 +1513,9 @@
           <w:noProof/>
           <w:lang w:val="fr-FR" w:eastAsia="fr-FR"/>
         </w:rPr>
+        <w:lastRenderedPageBreak/>
         <w:drawing>
-          <wp:inline distT="0" distB="0" distL="0" distR="0" wp14:anchorId="5D705996" wp14:editId="2F4D64A7">
+          <wp:inline distT="0" distB="0" distL="0" distR="0" wp14:anchorId="3619A406" wp14:editId="10B64B2E">
             <wp:extent cx="6123305" cy="1823085"/>
             <wp:effectExtent l="0" t="0" r="0" b="0"/>
             <wp:docPr id="1" name="Image 1"/>
@@ -1481,49 +1595,242 @@
         <w:t>:</w:t>
       </w:r>
       <w:r>
-        <w:t xml:space="preserve"> An example of a 1</w:t>
+        <w:t xml:space="preserve"> An example of a 17 cm width image best using the page width. The figure was prepared with Inkscape in SVG format and incorporated in Word as a raster image</w:t>
+      </w:r>
+      <w:r>
+        <w:t>.</w:t>
+      </w:r>
+      <w:r>
+        <w:t xml:space="preserve"> The caption should be long enough for a reader to quickly understand what the figure shows without having to read the full paper. Please try to place figures on top of page or after section titles. All figures should be referenced in the text, placed and numbered in order of first reference.</w:t>
+      </w:r>
+    </w:p>
+    <w:p>
+      <w:pPr>
+        <w:pStyle w:val="RINGSubSubSection"/>
+      </w:pPr>
+      <w:r>
+        <w:t>Configuring Zotero</w:t>
+      </w:r>
+      <w:r>
+        <w:t xml:space="preserve"> to use </w:t>
+      </w:r>
+      <w:r>
+        <w:t>the RING202</w:t>
+      </w:r>
+      <w:r>
+        <w:t>3</w:t>
+      </w:r>
+      <w:r>
+        <w:t xml:space="preserve"> style</w:t>
+      </w:r>
+    </w:p>
+    <w:p>
+      <w:pPr>
+        <w:pStyle w:val="GocadNormal"/>
+      </w:pPr>
+      <w:r>
+        <w:t xml:space="preserve">In Zotero, you can go to </w:t>
+      </w:r>
+      <w:r>
+        <w:rPr>
+          <w:b/>
+          <w:bCs/>
+        </w:rPr>
+        <w:t>Edit / Preferences</w:t>
+      </w:r>
+      <w:r>
+        <w:t xml:space="preserve"> and then select the Citation tab</w:t>
+      </w:r>
+      <w:r>
+        <w:t xml:space="preserve">. From there, you can </w:t>
+      </w:r>
+      <w:r>
+        <w:t>l</w:t>
+      </w:r>
+      <w:r>
+        <w:t xml:space="preserve">oad the </w:t>
+      </w:r>
+      <w:r>
+        <w:t>RING202</w:t>
+      </w:r>
+      <w:r>
+        <w:t>3</w:t>
+      </w:r>
+      <w:r>
+        <w:t>.c</w:t>
+      </w:r>
+      <w:r>
+        <w:t>s</w:t>
+      </w:r>
+      <w:r>
+        <w:t>l</w:t>
+      </w:r>
+      <w:r>
+        <w:t xml:space="preserve"> </w:t>
+      </w:r>
+      <w:r>
+        <w:t xml:space="preserve">citation style, which can then be selected in the Document preferences of the Word Zotero plugin </w:t>
+      </w:r>
+      <w:r>
+        <w:t>m</w:t>
+      </w:r>
+      <w:r>
+        <w:t>enu.</w:t>
+      </w:r>
+      <w:r>
+        <w:t xml:space="preserve"> </w:t>
+      </w:r>
+      <w:r>
+        <w:t xml:space="preserve">Further documentation is available from the Zotero Word plugin. </w:t>
+      </w:r>
+      <w:r>
+        <w:t>Please note that Zotero tend</w:t>
+      </w:r>
+      <w:r>
+        <w:t>s</w:t>
+      </w:r>
+      <w:r>
+        <w:t xml:space="preserve"> to insert reference</w:t>
+      </w:r>
+      <w:r>
+        <w:t>s</w:t>
+      </w:r>
+      <w:r>
+        <w:t xml:space="preserve"> with double line spacing. Before sending your final camera-ready paper, please take the time to reset to single line spacing manually if this happens (</w:t>
+      </w:r>
+      <w:r>
+        <w:t xml:space="preserve">hopefully someday this will be </w:t>
+      </w:r>
+      <w:r>
+        <w:t>fix</w:t>
+      </w:r>
+      <w:r>
+        <w:t>ed</w:t>
+      </w:r>
+      <w:r>
+        <w:t>).</w:t>
+      </w:r>
+    </w:p>
+    <w:p>
+      <w:pPr>
+        <w:pStyle w:val="RINGSubSubSection"/>
+      </w:pPr>
+      <w:r>
+        <w:t>Configuring Mendeley</w:t>
+      </w:r>
+      <w:r>
+        <w:t xml:space="preserve"> to use </w:t>
+      </w:r>
+      <w:r>
+        <w:t>the RING202</w:t>
+      </w:r>
+      <w:r>
+        <w:t>3</w:t>
+      </w:r>
+      <w:r>
+        <w:t xml:space="preserve"> </w:t>
+      </w:r>
+      <w:r>
+        <w:t>style</w:t>
+      </w:r>
+    </w:p>
+    <w:p>
+      <w:pPr>
+        <w:pStyle w:val="GocadNormal"/>
+      </w:pPr>
+      <w:r>
+        <w:t xml:space="preserve">Please refer to the Mendeley and Mendeley Word plugin documentation. </w:t>
+      </w:r>
+    </w:p>
+    <w:p>
+      <w:pPr>
+        <w:pStyle w:val="Titre2"/>
+      </w:pPr>
+      <w:r>
+        <w:t>Figures</w:t>
+      </w:r>
+    </w:p>
+    <w:p>
+      <w:pPr>
+        <w:pStyle w:val="GocadNormal"/>
+      </w:pPr>
+      <w:r>
+        <w:t>Figures may be prepared in SVG or AI format or other vector format, but will be best included in Word documents as raster images</w:t>
+      </w:r>
+      <w:r>
+        <w:t xml:space="preserve"> </w:t>
+      </w:r>
+      <w:r>
+        <w:t xml:space="preserve">in </w:t>
+      </w:r>
+      <w:r>
+        <w:t>PNG</w:t>
+      </w:r>
+      <w:r>
+        <w:t xml:space="preserve"> (lossless) or </w:t>
+      </w:r>
+      <w:r>
+        <w:t>JPEG</w:t>
+      </w:r>
+      <w:r>
+        <w:t xml:space="preserve"> (lossy) formats </w:t>
+      </w:r>
+      <w:r>
+        <w:t>(</w:t>
+      </w:r>
+      <w:r>
+        <w:fldChar w:fldCharType="begin"/>
+      </w:r>
+      <w:r>
+        <w:instrText xml:space="preserve"> REF _Ref37094904 \h  \* MERGEFORMAT </w:instrText>
+      </w:r>
+      <w:r>
+        <w:fldChar w:fldCharType="separate"/>
+      </w:r>
+      <w:r>
+        <w:t xml:space="preserve">Figure </w:t>
+      </w:r>
+      <w:r>
+        <w:t>1</w:t>
+      </w:r>
+      <w:r>
+        <w:fldChar w:fldCharType="end"/>
+      </w:r>
+      <w:r>
+        <w:t>)</w:t>
+      </w:r>
+      <w:r>
+        <w:t>. Please use Arial for figure annotations and labeling</w:t>
+      </w:r>
+      <w:r>
+        <w:t xml:space="preserve">, </w:t>
+      </w:r>
+      <w:r>
+        <w:t xml:space="preserve">and check that the label size has approximately the same size as the main text </w:t>
+      </w:r>
+      <w:r>
+        <w:t>in the final document</w:t>
+      </w:r>
+      <w:r>
+        <w:t>.</w:t>
+      </w:r>
+      <w:r>
+        <w:t xml:space="preserve"> When preparing figure</w:t>
+      </w:r>
+      <w:r>
+        <w:t>s</w:t>
+      </w:r>
+      <w:r>
+        <w:t xml:space="preserve"> for RING Proceedings</w:t>
+      </w:r>
+      <w:r>
+        <w:t>, it is best to think about the layout to make the best use of A4 page width (1</w:t>
       </w:r>
       <w:r>
         <w:t>7</w:t>
       </w:r>
       <w:r>
-        <w:t xml:space="preserve"> cm width image best using the page width. The figure was prepared with Ink</w:t>
-      </w:r>
-      <w:r>
-        <w:t>s</w:t>
-      </w:r>
-      <w:r>
-        <w:t>cape in SVG format</w:t>
-      </w:r>
-      <w:r>
-        <w:t xml:space="preserve"> and </w:t>
-      </w:r>
-      <w:r>
-        <w:t>incorpora</w:t>
-      </w:r>
-      <w:r>
-        <w:t>t</w:t>
-      </w:r>
-      <w:r>
-        <w:t>ed in Wor</w:t>
-      </w:r>
-      <w:r>
-        <w:t>d</w:t>
-      </w:r>
-      <w:r>
-        <w:t xml:space="preserve"> as a raster image</w:t>
-      </w:r>
-      <w:r>
-        <w:t>.</w:t>
-      </w:r>
-      <w:r>
-        <w:t xml:space="preserve"> The caption should </w:t>
-      </w:r>
-      <w:r>
-        <w:t xml:space="preserve">be long enough for a reader to quickly understand what the figure shows without having to read the full paper. </w:t>
-      </w:r>
-      <w:r>
-        <w:t>Please try to place figures on top of page or after section titles. All figures should be referenced in the text, placed and numbered in order of first reference.</w:t>
+        <w:t xml:space="preserve">cm width). </w:t>
       </w:r>
     </w:p>
     <w:p>
@@ -1531,98 +1838,13 @@
         <w:pStyle w:val="GocadNormal"/>
       </w:pPr>
       <w:r>
-        <w:t>Figures may be prepared in SVG or AI format or other vector format, but will be best included in Word documents as raster images</w:t>
-      </w:r>
-      <w:r>
-        <w:t xml:space="preserve"> </w:t>
-      </w:r>
-      <w:r>
-        <w:t xml:space="preserve">in </w:t>
-      </w:r>
-      <w:r>
-        <w:t>PNG</w:t>
-      </w:r>
-      <w:r>
-        <w:t xml:space="preserve"> (lossless) or </w:t>
-      </w:r>
-      <w:r>
-        <w:t>JPEG</w:t>
-      </w:r>
-      <w:r>
-        <w:t xml:space="preserve"> (</w:t>
-      </w:r>
-      <w:proofErr w:type="spellStart"/>
-      <w:r>
-        <w:t>lossy</w:t>
-      </w:r>
-      <w:proofErr w:type="spellEnd"/>
-      <w:r>
-        <w:t xml:space="preserve">) formats </w:t>
-      </w:r>
-      <w:r>
-        <w:t>(</w:t>
-      </w:r>
-      <w:r>
-        <w:fldChar w:fldCharType="begin"/>
-      </w:r>
-      <w:r>
-        <w:instrText xml:space="preserve"> REF _Ref37094904 \h  \* MERGEFORMAT </w:instrText>
-      </w:r>
-      <w:r>
-        <w:fldChar w:fldCharType="separate"/>
-      </w:r>
-      <w:r>
-        <w:t xml:space="preserve">Figure </w:t>
-      </w:r>
-      <w:r>
-        <w:t>1</w:t>
-      </w:r>
-      <w:r>
-        <w:fldChar w:fldCharType="end"/>
-      </w:r>
-      <w:r>
-        <w:t>)</w:t>
-      </w:r>
-      <w:r>
-        <w:t>. Please use Arial for figure annotations and labeling</w:t>
-      </w:r>
-      <w:r>
-        <w:t xml:space="preserve">, </w:t>
-      </w:r>
-      <w:r>
-        <w:t xml:space="preserve">and check that the label size has approximately the same size as the main text </w:t>
-      </w:r>
-      <w:r>
-        <w:t>in the final document</w:t>
-      </w:r>
-      <w:r>
-        <w:t>.</w:t>
-      </w:r>
-      <w:r>
-        <w:t xml:space="preserve"> When preparing figure</w:t>
-      </w:r>
-      <w:r>
-        <w:t>s</w:t>
-      </w:r>
-      <w:r>
-        <w:t xml:space="preserve"> for RING Proceedings</w:t>
-      </w:r>
-      <w:r>
-        <w:t>, it is best to think about the layout to make the best use of A4 page width (1</w:t>
-      </w:r>
-      <w:r>
-        <w:t>7</w:t>
-      </w:r>
-      <w:r>
-        <w:t xml:space="preserve">cm width). </w:t>
-      </w:r>
-    </w:p>
-    <w:p>
-      <w:pPr>
-        <w:pStyle w:val="GocadNormal"/>
-      </w:pPr>
-      <w:r>
-        <w:t>Please place figures at top of pages (the default placement option</w:t>
+        <w:t xml:space="preserve">Please place figures at top </w:t>
+      </w:r>
+      <w:r>
+        <w:t xml:space="preserve">(or bottom) </w:t>
+      </w:r>
+      <w:r>
+        <w:t>of pages (the default placement option</w:t>
       </w:r>
       <w:r>
         <w:t xml:space="preserve"> in LaTeX</w:t>
@@ -1804,8 +2026,8 @@
         <w:tblLook w:val="04A0" w:firstRow="1" w:lastRow="0" w:firstColumn="1" w:lastColumn="0" w:noHBand="0" w:noVBand="1"/>
       </w:tblPr>
       <w:tblGrid>
-        <w:gridCol w:w="8784"/>
-        <w:gridCol w:w="866"/>
+        <w:gridCol w:w="8505"/>
+        <w:gridCol w:w="850"/>
       </w:tblGrid>
       <w:tr>
         <w:tc>
@@ -2213,7 +2435,11 @@
         <w:t xml:space="preserve"> be indented</w:t>
       </w:r>
       <w:r>
-        <w:t xml:space="preserve"> if a new paragraph is started</w:t>
+        <w:t xml:space="preserve"> if a new paragraph is </w:t>
+      </w:r>
+      <w:r>
+        <w:lastRenderedPageBreak/>
+        <w:t>started</w:t>
       </w:r>
       <w:r>
         <w:t>. The equation</w:t>
@@ -2348,13 +2574,8 @@
         </m:r>
       </m:oMath>
       <w:r>
-        <w:t xml:space="preserve"> to the </w:t>
-      </w:r>
-      <w:proofErr w:type="gramStart"/>
-      <w:r>
-        <w:t xml:space="preserve">data </w:t>
-      </w:r>
-      <w:proofErr w:type="gramEnd"/>
+        <w:t xml:space="preserve"> to the data </w:t>
+      </w:r>
       <m:oMath>
         <m:r>
           <m:rPr>
@@ -2619,16 +2840,8 @@
         <w:rPr>
           <w:rStyle w:val="EqStyleCar"/>
         </w:rPr>
-        <w:t xml:space="preserve">into the posterior </w:t>
-      </w:r>
-      <w:proofErr w:type="gramStart"/>
-      <w:r>
-        <w:rPr>
-          <w:rStyle w:val="EqStyleCar"/>
-        </w:rPr>
-        <w:t xml:space="preserve">distribution </w:t>
-      </w:r>
-      <w:proofErr w:type="gramEnd"/>
+        <w:t xml:space="preserve">into the posterior distribution </w:t>
+      </w:r>
       <m:oMath>
         <m:r>
           <w:rPr>
@@ -2765,8 +2978,8 @@
       <w:pPr>
         <w:pStyle w:val="Titre1"/>
       </w:pPr>
-      <w:r>
-        <w:lastRenderedPageBreak/>
+      <w:bookmarkStart w:id="3" w:name="_Ref221719896"/>
+      <w:r>
         <w:t>Results</w:t>
       </w:r>
       <w:r>
@@ -2776,8 +2989,15 @@
         <w:t xml:space="preserve"> </w:t>
       </w:r>
       <w:r>
-        <w:t>[Section title Can be changed to be more specific]</w:t>
-      </w:r>
+        <w:t xml:space="preserve">[Section title </w:t>
+      </w:r>
+      <w:r>
+        <w:t>c</w:t>
+      </w:r>
+      <w:r>
+        <w:t>an be changed to be more specific]</w:t>
+      </w:r>
+      <w:bookmarkEnd w:id="3"/>
     </w:p>
     <w:p>
       <w:pPr>
@@ -3091,17 +3311,25 @@
       <w:pPr>
         <w:pStyle w:val="Titre1"/>
       </w:pPr>
-      <w:bookmarkStart w:id="3" w:name="_Ref37265013"/>
+      <w:bookmarkStart w:id="4" w:name="_Ref37265013"/>
+      <w:bookmarkStart w:id="5" w:name="_Ref221719911"/>
       <w:r>
         <w:t>Discussion</w:t>
       </w:r>
-      <w:bookmarkEnd w:id="3"/>
+      <w:bookmarkEnd w:id="4"/>
       <w:r>
         <w:t xml:space="preserve"> </w:t>
       </w:r>
       <w:r>
-        <w:t>[Section title Can be changed to be more specific]</w:t>
-      </w:r>
+        <w:t xml:space="preserve">[Section title </w:t>
+      </w:r>
+      <w:r>
+        <w:t>c</w:t>
+      </w:r>
+      <w:r>
+        <w:t>an be changed to be more specific]</w:t>
+      </w:r>
+      <w:bookmarkEnd w:id="5"/>
     </w:p>
     <w:p>
       <w:r>
@@ -3120,23 +3348,38 @@
         <w:t xml:space="preserve"> the open problems discussed in the introduction</w:t>
       </w:r>
       <w:r>
-        <w:t>. It is often appropriate to include references to feed the discussion and make it both broader and more substantial than a simple wish list fully centered on your work</w:t>
+        <w:t xml:space="preserve">. It is often appropriate to include references to feed the discussion and make it both broader and more substantial than a simple wish list </w:t>
+      </w:r>
+      <w:r>
+        <w:t>only</w:t>
+      </w:r>
+      <w:r>
+        <w:t xml:space="preserve"> centered on your work</w:t>
       </w:r>
       <w:r>
         <w:t xml:space="preserve">. </w:t>
       </w:r>
-    </w:p>
-    <w:p>
-      <w:r>
-        <w:t xml:space="preserve">This section is the place to do philosophy, and to integrate the learnings from the method and results section. It is common that doubts and may persist on some aspects of the paper. The discussion is the place to </w:t>
+      <w:r>
+        <w:t xml:space="preserve">In which case is your method most interesting? What is it good at, and what are the tradeoffs as compared to previous approaches? When/where does it break? </w:t>
+      </w:r>
+    </w:p>
+    <w:p>
+      <w:r>
+        <w:t xml:space="preserve">This section is the place to do philosophy, and to integrate the learnings from the method and results section. It is common that doubts may persist </w:t>
       </w:r>
       <w:proofErr w:type="gramStart"/>
       <w:r>
-        <w:t>discuss(</w:t>
+        <w:t>on</w:t>
       </w:r>
       <w:proofErr w:type="gramEnd"/>
       <w:r>
-        <w:t>!) these doubts: as Richard Feynman said, ``When a scientist doesn't know the answer to a problem, he is ignorant. When he has a hunch as to what the result is, he is uncertain. And when he is pretty damn sure of what the result is going to be, he is still in some doubt''. In terms of style, please make a clear distinction between facts, interpretations, speculations</w:t>
+        <w:t xml:space="preserve"> some aspects of the paper</w:t>
+      </w:r>
+      <w:r>
+        <w:t>, for instance on some the relevance of some assumptions</w:t>
+      </w:r>
+      <w:r>
+        <w:t>. The discussion is the place to discuss(!) these doubts: as Richard Feynman said, ``When a scientist doesn't know the answer to a problem, he is ignorant. When he has a hunch as to what the result is, he is uncertain. And when he is pretty damn sure of what the result is going to be, he is still in some doubt''. In terms of style, please make a clear distinction between facts, interpretations, speculations</w:t>
       </w:r>
       <w:r>
         <w:t>,</w:t>
@@ -3185,14 +3428,34 @@
         <w:t xml:space="preserve"> </w:t>
       </w:r>
       <w:r>
-        <w:t xml:space="preserve">of your paper. </w:t>
-      </w:r>
+        <w:t>of your paper</w:t>
+      </w:r>
+      <w:r>
+        <w:t xml:space="preserve">. </w:t>
+      </w:r>
+      <w:r>
+        <w:t xml:space="preserve">This is the place to build on the method, results and discussion sections to stress the main things we </w:t>
+      </w:r>
+      <w:proofErr w:type="gramStart"/>
+      <w:r>
+        <w:t>learned</w:t>
+      </w:r>
+      <w:proofErr w:type="gramEnd"/>
+      <w:r>
+        <w:t xml:space="preserve"> and the main insights gained from your work. </w:t>
+      </w:r>
+    </w:p>
+    <w:p>
+      <w:pPr>
+        <w:pStyle w:val="GocadNormal"/>
+      </w:pPr>
     </w:p>
     <w:p>
       <w:pPr>
         <w:pStyle w:val="RINGSectionU"/>
       </w:pPr>
       <w:r>
+        <w:lastRenderedPageBreak/>
         <w:t>Acknowledgments</w:t>
       </w:r>
     </w:p>
@@ -3248,38 +3511,64 @@
         <w:rPr>
           <w:lang w:eastAsia="en-US"/>
         </w:rPr>
-        <w:t xml:space="preserve"> plugin of SKUA-</w:t>
+        <w:t xml:space="preserve"> plugin of </w:t>
+      </w:r>
+      <w:r>
+        <w:rPr>
+          <w:lang w:eastAsia="en-US"/>
+        </w:rPr>
+        <w:t>ASPEN-</w:t>
+      </w:r>
+      <w:r>
+        <w:rPr>
+          <w:lang w:eastAsia="en-US"/>
+        </w:rPr>
+        <w:t xml:space="preserve">SKUA </w:t>
       </w:r>
       <w:proofErr w:type="spellStart"/>
       <w:r>
         <w:rPr>
           <w:lang w:eastAsia="en-US"/>
         </w:rPr>
-        <w:t>Gocad</w:t>
+        <w:t>geomodeling</w:t>
       </w:r>
       <w:proofErr w:type="spellEnd"/>
       <w:r>
         <w:rPr>
           <w:lang w:eastAsia="en-US"/>
         </w:rPr>
-        <w:t xml:space="preserve"> geomodeling software]. We also acknowledge [</w:t>
-      </w:r>
+        <w:t xml:space="preserve"> software]. We also acknowledge [</w:t>
+      </w:r>
+      <w:proofErr w:type="spellStart"/>
       <w:r>
         <w:rPr>
           <w:lang w:eastAsia="en-US"/>
         </w:rPr>
         <w:t>AspenTech</w:t>
       </w:r>
+      <w:proofErr w:type="spellEnd"/>
       <w:r>
         <w:rPr>
           <w:lang w:eastAsia="en-US"/>
         </w:rPr>
-        <w:t xml:space="preserve"> for the SKUA-Gocad Software and development kit | S</w:t>
+        <w:t xml:space="preserve"> for the </w:t>
       </w:r>
       <w:r>
         <w:rPr>
           <w:lang w:eastAsia="en-US"/>
         </w:rPr>
+        <w:t>ASPEN-</w:t>
+      </w:r>
+      <w:r>
+        <w:rPr>
+          <w:lang w:eastAsia="en-US"/>
+        </w:rPr>
+        <w:t>SKUA Software and development kit | S</w:t>
+      </w:r>
+      <w:r>
+        <w:rPr>
+          <w:lang w:eastAsia="en-US"/>
+        </w:rPr>
         <w:t>LB</w:t>
       </w:r>
       <w:r>
@@ -3319,125 +3608,67 @@
     </w:p>
     <w:p>
       <w:pPr>
-        <w:pStyle w:val="Bibliographie"/>
-        <w:rPr>
-          <w:sz w:val="20"/>
-        </w:rPr>
-      </w:pPr>
-      <w:r>
-        <w:fldChar w:fldCharType="begin"/>
-      </w:r>
-      <w:r>
-        <w:instrText xml:space="preserve"> ADDIN ZOTERO_BIBL {"uncited":[],"omitted":[],"custom":[]} CSL_BIBLIOGRAPHY </w:instrText>
-      </w:r>
-      <w:r>
-        <w:fldChar w:fldCharType="separate"/>
-      </w:r>
-      <w:r>
-        <w:rPr>
-          <w:smallCaps/>
-          <w:sz w:val="20"/>
-        </w:rPr>
-        <w:t>Capdeville Y, Cupillard P &amp; Singh S</w:t>
-      </w:r>
-      <w:r>
-        <w:rPr>
-          <w:sz w:val="20"/>
-        </w:rPr>
-        <w:t xml:space="preserve">. (2020). An introduction to the two-scale homogenization method for seismology. In: </w:t>
+        <w:ind w:firstLine="0"/>
+      </w:pPr>
+      <w:r>
+        <w:t>[</w:t>
       </w:r>
       <w:r>
         <w:rPr>
           <w:i/>
           <w:iCs/>
-          <w:sz w:val="20"/>
-        </w:rPr>
-        <w:t>Advances in Geophysics</w:t>
-      </w:r>
-      <w:r>
-        <w:rPr>
-          <w:sz w:val="20"/>
-        </w:rPr>
-        <w:t xml:space="preserve"> (Vol. 61, p. 217‑306). Elsevier. https://doi.org/10.1016/bs.agph.2020.07.001</w:t>
-      </w:r>
-    </w:p>
-    <w:p>
-      <w:pPr>
-        <w:pStyle w:val="Bibliographie"/>
-        <w:rPr>
-          <w:sz w:val="20"/>
-        </w:rPr>
-      </w:pPr>
-      <w:r>
-        <w:rPr>
-          <w:smallCaps/>
-          <w:sz w:val="20"/>
-        </w:rPr>
-        <w:lastRenderedPageBreak/>
-        <w:t>Claerbout J</w:t>
-      </w:r>
-      <w:r>
-        <w:rPr>
-          <w:sz w:val="20"/>
-        </w:rPr>
-        <w:t xml:space="preserve">. (1988). A scrutiny of the introduction. In: </w:t>
-      </w:r>
+        </w:rPr>
+        <w:t xml:space="preserve">When using Zotero and the </w:t>
+      </w:r>
+      <w:proofErr w:type="spellStart"/>
       <w:r>
         <w:rPr>
           <w:i/>
           <w:iCs/>
-          <w:sz w:val="20"/>
-        </w:rPr>
-        <w:t>SEP-59</w:t>
-      </w:r>
-      <w:r>
-        <w:rPr>
-          <w:sz w:val="20"/>
-        </w:rPr>
-        <w:t xml:space="preserve"> (p. 287‑290). http://sep.stanford.edu/data/media/public/oldreports/oldreports/oldreports/sep59/</w:t>
-      </w:r>
-    </w:p>
-    <w:p>
-      <w:pPr>
-        <w:pStyle w:val="Bibliographie"/>
-        <w:rPr>
-          <w:sz w:val="20"/>
-        </w:rPr>
-      </w:pPr>
-      <w:r>
-        <w:rPr>
-          <w:smallCaps/>
-          <w:sz w:val="20"/>
-          <w:lang w:val="fr-FR"/>
-        </w:rPr>
-        <w:t>Collon P, Bernasconi D, Vuilleumier C &amp; Renard P</w:t>
-      </w:r>
-      <w:r>
-        <w:rPr>
-          <w:sz w:val="20"/>
-          <w:lang w:val="fr-FR"/>
-        </w:rPr>
-        <w:t xml:space="preserve">. (2017). </w:t>
-      </w:r>
-      <w:r>
-        <w:rPr>
-          <w:sz w:val="20"/>
-        </w:rPr>
-        <w:t xml:space="preserve">Statistical metrics for the characterization of karst network geometry and topology. </w:t>
-      </w:r>
+        </w:rPr>
+        <w:t>RING.csl</w:t>
+      </w:r>
+      <w:proofErr w:type="spellEnd"/>
       <w:r>
         <w:rPr>
           <w:i/>
           <w:iCs/>
-          <w:sz w:val="20"/>
-        </w:rPr>
-        <w:t>Geomorphology</w:t>
-      </w:r>
-      <w:r>
-        <w:rPr>
-          <w:sz w:val="20"/>
-        </w:rPr>
-        <w:t xml:space="preserve"> </w:t>
+        </w:rPr>
+        <w:t xml:space="preserve"> style to generate the list of references, please manually reset the block to single line spacing</w:t>
+      </w:r>
+      <w:r>
+        <w:t>]</w:t>
+      </w:r>
+    </w:p>
+    <w:p>
+      <w:pPr>
+        <w:pStyle w:val="Bibliographie"/>
+        <w:spacing w:line="240" w:lineRule="auto"/>
+        <w:rPr>
+          <w:sz w:val="20"/>
+        </w:rPr>
+      </w:pPr>
+      <w:r>
+        <w:fldChar w:fldCharType="begin"/>
+      </w:r>
+      <w:r>
+        <w:instrText xml:space="preserve"> ADDIN ZOTERO_BIBL {"uncited":[],"omitted":[],"custom":[]} CSL_BIBLIOGRAPHY </w:instrText>
+      </w:r>
+      <w:r>
+        <w:fldChar w:fldCharType="separate"/>
+      </w:r>
+      <w:r>
+        <w:rPr>
+          <w:smallCaps/>
+          <w:sz w:val="20"/>
+        </w:rPr>
+        <w:t>Capdeville Y, Cupillard P &amp; Singh S</w:t>
+      </w:r>
+      <w:r>
+        <w:rPr>
+          <w:sz w:val="20"/>
+        </w:rPr>
+        <w:t xml:space="preserve">. (2020). An introduction to the two-scale homogenization method for seismology. In: </w:t>
       </w:r>
       <w:r>
         <w:rPr>
@@ -3445,18 +3676,19 @@
           <w:iCs/>
           <w:sz w:val="20"/>
         </w:rPr>
-        <w:t>283</w:t>
-      </w:r>
-      <w:r>
-        <w:rPr>
-          <w:sz w:val="20"/>
-        </w:rPr>
-        <w:t>:122‑142. https://doi.org/10.1016/j.geomorph.2017.01.034</w:t>
+        <w:t>Advances in Geophysics</w:t>
+      </w:r>
+      <w:r>
+        <w:rPr>
+          <w:sz w:val="20"/>
+        </w:rPr>
+        <w:t xml:space="preserve"> (Vol. 61, p. 217‑306). Elsevier. https://doi.org/10.1016/bs.agph.2020.07.001</w:t>
       </w:r>
     </w:p>
     <w:p>
       <w:pPr>
         <w:pStyle w:val="Bibliographie"/>
+        <w:spacing w:line="240" w:lineRule="auto"/>
         <w:rPr>
           <w:sz w:val="20"/>
         </w:rPr>
@@ -3466,13 +3698,13 @@
           <w:smallCaps/>
           <w:sz w:val="20"/>
         </w:rPr>
-        <w:t>Freeman B, Yielding G &amp; Badley M</w:t>
-      </w:r>
-      <w:r>
-        <w:rPr>
-          <w:sz w:val="20"/>
-        </w:rPr>
-        <w:t xml:space="preserve">. (1990). Fault correlation during seismic interpretation. </w:t>
+        <w:t>Claerbout J</w:t>
+      </w:r>
+      <w:r>
+        <w:rPr>
+          <w:sz w:val="20"/>
+        </w:rPr>
+        <w:t xml:space="preserve">. (1988). A scrutiny of the introduction. In: </w:t>
       </w:r>
       <w:r>
         <w:rPr>
@@ -3480,13 +3712,43 @@
           <w:iCs/>
           <w:sz w:val="20"/>
         </w:rPr>
-        <w:t>First Break</w:t>
-      </w:r>
-      <w:r>
-        <w:rPr>
-          <w:sz w:val="20"/>
-        </w:rPr>
-        <w:t xml:space="preserve"> </w:t>
+        <w:t>SEP-59</w:t>
+      </w:r>
+      <w:r>
+        <w:rPr>
+          <w:sz w:val="20"/>
+        </w:rPr>
+        <w:t xml:space="preserve"> (p. 287‑290). http://sep.stanford.edu/data/media/public/oldreports/oldreports/oldreports/sep59/</w:t>
+      </w:r>
+    </w:p>
+    <w:p>
+      <w:pPr>
+        <w:pStyle w:val="Bibliographie"/>
+        <w:spacing w:line="240" w:lineRule="auto"/>
+        <w:rPr>
+          <w:sz w:val="20"/>
+        </w:rPr>
+      </w:pPr>
+      <w:r>
+        <w:rPr>
+          <w:smallCaps/>
+          <w:sz w:val="20"/>
+          <w:lang w:val="fr-FR"/>
+        </w:rPr>
+        <w:t>Collon P, Bernasconi D, Vuilleumier C &amp; Renard P</w:t>
+      </w:r>
+      <w:r>
+        <w:rPr>
+          <w:sz w:val="20"/>
+          <w:lang w:val="fr-FR"/>
+        </w:rPr>
+        <w:t xml:space="preserve">. (2017). </w:t>
+      </w:r>
+      <w:r>
+        <w:rPr>
+          <w:sz w:val="20"/>
+        </w:rPr>
+        <w:t xml:space="preserve">Statistical metrics for the characterization of karst network geometry and topology. </w:t>
       </w:r>
       <w:r>
         <w:rPr>
@@ -3494,34 +3756,13 @@
           <w:iCs/>
           <w:sz w:val="20"/>
         </w:rPr>
-        <w:t>8</w:t>
-      </w:r>
-      <w:r>
-        <w:rPr>
-          <w:sz w:val="20"/>
-        </w:rPr>
-        <w:t>(3). http://www.earthdoc.org/publication/publicationdetails/?publication=28228</w:t>
-      </w:r>
-    </w:p>
-    <w:p>
-      <w:pPr>
-        <w:pStyle w:val="Bibliographie"/>
-        <w:rPr>
-          <w:sz w:val="20"/>
-        </w:rPr>
-      </w:pPr>
-      <w:r>
-        <w:rPr>
-          <w:smallCaps/>
-          <w:sz w:val="20"/>
-        </w:rPr>
-        <w:t>Kolditz O, Bauer S, Bilke L, Böttcher N, Delfs JO, Fischer T, Görke UJ, Kalbacher T, Kosakowski G, McDermott CI, Park CH, Radu F, Rink K, Shao H, Shao HB, Sun F, Sun YY, Singh AK, Taron J, … Zehner B</w:t>
-      </w:r>
-      <w:r>
-        <w:rPr>
-          <w:sz w:val="20"/>
-        </w:rPr>
-        <w:t xml:space="preserve">. (2012). OpenGeoSys: an open-source initiative for numerical simulation of thermo-hydro-mechanical/chemical (THM/C) processes in porous media. </w:t>
+        <w:t>Geomorphology</w:t>
+      </w:r>
+      <w:r>
+        <w:rPr>
+          <w:sz w:val="20"/>
+        </w:rPr>
+        <w:t xml:space="preserve"> </w:t>
       </w:r>
       <w:r>
         <w:rPr>
@@ -3529,13 +3770,35 @@
           <w:iCs/>
           <w:sz w:val="20"/>
         </w:rPr>
-        <w:t>Environmental Earth Sciences</w:t>
-      </w:r>
-      <w:r>
-        <w:rPr>
-          <w:sz w:val="20"/>
-        </w:rPr>
-        <w:t xml:space="preserve"> </w:t>
+        <w:t>283</w:t>
+      </w:r>
+      <w:r>
+        <w:rPr>
+          <w:sz w:val="20"/>
+        </w:rPr>
+        <w:t>:122‑142. https://doi.org/10.1016/j.geomorph.2017.01.034</w:t>
+      </w:r>
+    </w:p>
+    <w:p>
+      <w:pPr>
+        <w:pStyle w:val="Bibliographie"/>
+        <w:spacing w:line="240" w:lineRule="auto"/>
+        <w:rPr>
+          <w:sz w:val="20"/>
+        </w:rPr>
+      </w:pPr>
+      <w:r>
+        <w:rPr>
+          <w:smallCaps/>
+          <w:sz w:val="20"/>
+        </w:rPr>
+        <w:t>Freeman B, Yielding G &amp; Badley M</w:t>
+      </w:r>
+      <w:r>
+        <w:rPr>
+          <w:sz w:val="20"/>
+        </w:rPr>
+        <w:t xml:space="preserve">. (1990). Fault correlation during seismic interpretation. </w:t>
       </w:r>
       <w:r>
         <w:rPr>
@@ -3543,34 +3806,13 @@
           <w:iCs/>
           <w:sz w:val="20"/>
         </w:rPr>
-        <w:t>67</w:t>
-      </w:r>
-      <w:r>
-        <w:rPr>
-          <w:sz w:val="20"/>
-        </w:rPr>
-        <w:t>(2):589‑599. https://doi.org/10.1007/s12665-012-1546-x</w:t>
-      </w:r>
-    </w:p>
-    <w:p>
-      <w:pPr>
-        <w:pStyle w:val="Bibliographie"/>
-        <w:rPr>
-          <w:sz w:val="20"/>
-        </w:rPr>
-      </w:pPr>
-      <w:r>
-        <w:rPr>
-          <w:smallCaps/>
-          <w:sz w:val="20"/>
-        </w:rPr>
-        <w:t>Landes KK</w:t>
-      </w:r>
-      <w:r>
-        <w:rPr>
-          <w:sz w:val="20"/>
-        </w:rPr>
-        <w:t xml:space="preserve">. (1966). A scrutiny of the abstract, II. </w:t>
+        <w:t>First Break</w:t>
+      </w:r>
+      <w:r>
+        <w:rPr>
+          <w:sz w:val="20"/>
+        </w:rPr>
+        <w:t xml:space="preserve"> </w:t>
       </w:r>
       <w:r>
         <w:rPr>
@@ -3578,13 +3820,35 @@
           <w:iCs/>
           <w:sz w:val="20"/>
         </w:rPr>
-        <w:t>Bulletin of the Americal Association of Petroleum Geologists</w:t>
-      </w:r>
-      <w:r>
-        <w:rPr>
-          <w:sz w:val="20"/>
-        </w:rPr>
-        <w:t xml:space="preserve"> </w:t>
+        <w:t>8</w:t>
+      </w:r>
+      <w:r>
+        <w:rPr>
+          <w:sz w:val="20"/>
+        </w:rPr>
+        <w:t>(3). http://www.earthdoc.org/publication/publicationdetails/?publication=28228</w:t>
+      </w:r>
+    </w:p>
+    <w:p>
+      <w:pPr>
+        <w:pStyle w:val="Bibliographie"/>
+        <w:spacing w:line="240" w:lineRule="auto"/>
+        <w:rPr>
+          <w:sz w:val="20"/>
+        </w:rPr>
+      </w:pPr>
+      <w:r>
+        <w:rPr>
+          <w:smallCaps/>
+          <w:sz w:val="20"/>
+        </w:rPr>
+        <w:t>Kolditz O, Bauer S, Bilke L, Böttcher N, Delfs JO, Fischer T, Görke UJ, Kalbacher T, Kosakowski G, McDermott CI, Park CH, Radu F, Rink K, Shao H, Shao HB, Sun F, Sun YY, Singh AK, Taron J, … Zehner B</w:t>
+      </w:r>
+      <w:r>
+        <w:rPr>
+          <w:sz w:val="20"/>
+        </w:rPr>
+        <w:t xml:space="preserve">. (2012). OpenGeoSys: an open-source initiative for numerical simulation of thermo-hydro-mechanical/chemical (THM/C) processes in porous media. </w:t>
       </w:r>
       <w:r>
         <w:rPr>
@@ -3592,34 +3856,13 @@
           <w:iCs/>
           <w:sz w:val="20"/>
         </w:rPr>
-        <w:t>50</w:t>
-      </w:r>
-      <w:r>
-        <w:rPr>
-          <w:sz w:val="20"/>
-        </w:rPr>
-        <w:t>(9):1992.</w:t>
-      </w:r>
-    </w:p>
-    <w:p>
-      <w:pPr>
-        <w:pStyle w:val="Bibliographie"/>
-        <w:rPr>
-          <w:sz w:val="20"/>
-        </w:rPr>
-      </w:pPr>
-      <w:r>
-        <w:rPr>
-          <w:smallCaps/>
-          <w:sz w:val="20"/>
-        </w:rPr>
-        <w:t>Lee DKP</w:t>
-      </w:r>
-      <w:r>
-        <w:rPr>
-          <w:sz w:val="20"/>
-        </w:rPr>
-        <w:t xml:space="preserve">. (2010). </w:t>
+        <w:t>Environmental Earth Sciences</w:t>
+      </w:r>
+      <w:r>
+        <w:rPr>
+          <w:sz w:val="20"/>
+        </w:rPr>
+        <w:t xml:space="preserve"> </w:t>
       </w:r>
       <w:r>
         <w:rPr>
@@ -3627,18 +3870,19 @@
           <w:iCs/>
           <w:sz w:val="20"/>
         </w:rPr>
-        <w:t>A Guide to Writing Mathematics</w:t>
-      </w:r>
-      <w:r>
-        <w:rPr>
-          <w:sz w:val="20"/>
-        </w:rPr>
-        <w:t xml:space="preserve"> [Lecture notes]. http://</w:t>
+        <w:t>67</w:t>
+      </w:r>
+      <w:r>
+        <w:rPr>
+          <w:sz w:val="20"/>
+        </w:rPr>
+        <w:t>(2):589‑599. https://doi.org/10.1007/s12665-012-1546-x</w:t>
       </w:r>
     </w:p>
     <w:p>
       <w:pPr>
         <w:pStyle w:val="Bibliographie"/>
+        <w:spacing w:line="240" w:lineRule="auto"/>
         <w:rPr>
           <w:sz w:val="20"/>
         </w:rPr>
@@ -3648,13 +3892,13 @@
           <w:smallCaps/>
           <w:sz w:val="20"/>
         </w:rPr>
-        <w:t>Lowman P</w:t>
-      </w:r>
-      <w:r>
-        <w:rPr>
-          <w:sz w:val="20"/>
-        </w:rPr>
-        <w:t xml:space="preserve">. (1998). The abstract Rescrutinized. </w:t>
+        <w:t>Landes KK</w:t>
+      </w:r>
+      <w:r>
+        <w:rPr>
+          <w:sz w:val="20"/>
+        </w:rPr>
+        <w:t xml:space="preserve">. (1966). A scrutiny of the abstract, II. </w:t>
       </w:r>
       <w:r>
         <w:rPr>
@@ -3662,34 +3906,13 @@
           <w:iCs/>
           <w:sz w:val="20"/>
         </w:rPr>
-        <w:t>Geology</w:t>
-      </w:r>
-      <w:r>
-        <w:rPr>
-          <w:sz w:val="20"/>
-        </w:rPr>
-        <w:t>:1063. https://doi.org/10.1130/0091-7613(1988)016&lt;1063:TAR&gt;2.3.CO;2</w:t>
-      </w:r>
-    </w:p>
-    <w:p>
-      <w:pPr>
-        <w:pStyle w:val="Bibliographie"/>
-        <w:rPr>
-          <w:sz w:val="20"/>
-        </w:rPr>
-      </w:pPr>
-      <w:r>
-        <w:rPr>
-          <w:smallCaps/>
-          <w:sz w:val="20"/>
-        </w:rPr>
-        <w:t>Mallet J-L</w:t>
-      </w:r>
-      <w:r>
-        <w:rPr>
-          <w:sz w:val="20"/>
-        </w:rPr>
-        <w:t xml:space="preserve">. (2002). </w:t>
+        <w:t>Bulletin of the Americal Association of Petroleum Geologists</w:t>
+      </w:r>
+      <w:r>
+        <w:rPr>
+          <w:sz w:val="20"/>
+        </w:rPr>
+        <w:t xml:space="preserve"> </w:t>
       </w:r>
       <w:r>
         <w:rPr>
@@ -3697,18 +3920,19 @@
           <w:iCs/>
           <w:sz w:val="20"/>
         </w:rPr>
-        <w:t>Geomodeling</w:t>
-      </w:r>
-      <w:r>
-        <w:rPr>
-          <w:sz w:val="20"/>
-        </w:rPr>
-        <w:t>. Oxford University Press, USA.</w:t>
+        <w:t>50</w:t>
+      </w:r>
+      <w:r>
+        <w:rPr>
+          <w:sz w:val="20"/>
+        </w:rPr>
+        <w:t>(9):1992.</w:t>
       </w:r>
     </w:p>
     <w:p>
       <w:pPr>
         <w:pStyle w:val="Bibliographie"/>
+        <w:spacing w:line="240" w:lineRule="auto"/>
         <w:rPr>
           <w:sz w:val="20"/>
         </w:rPr>
@@ -3718,13 +3942,13 @@
           <w:smallCaps/>
           <w:sz w:val="20"/>
         </w:rPr>
-        <w:t>Mallet J-L</w:t>
-      </w:r>
-      <w:r>
-        <w:rPr>
-          <w:sz w:val="20"/>
-        </w:rPr>
-        <w:t xml:space="preserve">. (2014). </w:t>
+        <w:t>Lee DKP</w:t>
+      </w:r>
+      <w:r>
+        <w:rPr>
+          <w:sz w:val="20"/>
+        </w:rPr>
+        <w:t xml:space="preserve">. (2010). </w:t>
       </w:r>
       <w:r>
         <w:rPr>
@@ -3732,18 +3956,19 @@
           <w:iCs/>
           <w:sz w:val="20"/>
         </w:rPr>
-        <w:t>Elements of mathematical sedimentary geology: The GeoChron model</w:t>
-      </w:r>
-      <w:r>
-        <w:rPr>
-          <w:sz w:val="20"/>
-        </w:rPr>
-        <w:t>. EAGE publications.</w:t>
+        <w:t>A Guide to Writing Mathematics</w:t>
+      </w:r>
+      <w:r>
+        <w:rPr>
+          <w:sz w:val="20"/>
+        </w:rPr>
+        <w:t xml:space="preserve"> [Lecture notes]. http://</w:t>
       </w:r>
     </w:p>
     <w:p>
       <w:pPr>
         <w:pStyle w:val="Bibliographie"/>
+        <w:spacing w:line="240" w:lineRule="auto"/>
         <w:rPr>
           <w:sz w:val="20"/>
         </w:rPr>
@@ -3753,13 +3978,13 @@
           <w:smallCaps/>
           <w:sz w:val="20"/>
         </w:rPr>
-        <w:t>Perrin M &amp; Rainaud J-F</w:t>
-      </w:r>
-      <w:r>
-        <w:rPr>
-          <w:sz w:val="20"/>
-        </w:rPr>
-        <w:t xml:space="preserve">. (2013). </w:t>
+        <w:t>Lowman P</w:t>
+      </w:r>
+      <w:r>
+        <w:rPr>
+          <w:sz w:val="20"/>
+        </w:rPr>
+        <w:t xml:space="preserve">. (1998). The abstract Rescrutinized. </w:t>
       </w:r>
       <w:r>
         <w:rPr>
@@ -3767,18 +3992,19 @@
           <w:iCs/>
           <w:sz w:val="20"/>
         </w:rPr>
-        <w:t>Shared Earth Modeling: Knowledge Driven Solutions for Building and Managing Subsurface 3D Geological Models</w:t>
-      </w:r>
-      <w:r>
-        <w:rPr>
-          <w:sz w:val="20"/>
-        </w:rPr>
-        <w:t>. Editions Technip.</w:t>
+        <w:t>Geology</w:t>
+      </w:r>
+      <w:r>
+        <w:rPr>
+          <w:sz w:val="20"/>
+        </w:rPr>
+        <w:t>:1063. https://doi.org/10.1130/0091-7613(1988)016&lt;1063:TAR&gt;2.3.CO;2</w:t>
       </w:r>
     </w:p>
     <w:p>
       <w:pPr>
         <w:pStyle w:val="Bibliographie"/>
+        <w:spacing w:line="240" w:lineRule="auto"/>
         <w:rPr>
           <w:sz w:val="20"/>
         </w:rPr>
@@ -3788,13 +4014,13 @@
           <w:smallCaps/>
           <w:sz w:val="20"/>
         </w:rPr>
-        <w:t>Ringrose P &amp; Bentley M</w:t>
-      </w:r>
-      <w:r>
-        <w:rPr>
-          <w:sz w:val="20"/>
-        </w:rPr>
-        <w:t xml:space="preserve">. (2015). </w:t>
+        <w:t>Mallet J-L</w:t>
+      </w:r>
+      <w:r>
+        <w:rPr>
+          <w:sz w:val="20"/>
+        </w:rPr>
+        <w:t xml:space="preserve">. (2002). </w:t>
       </w:r>
       <w:r>
         <w:rPr>
@@ -3802,6 +4028,114 @@
           <w:iCs/>
           <w:sz w:val="20"/>
         </w:rPr>
+        <w:t>Geomodeling</w:t>
+      </w:r>
+      <w:r>
+        <w:rPr>
+          <w:sz w:val="20"/>
+        </w:rPr>
+        <w:t>. Oxford University Press, USA.</w:t>
+      </w:r>
+    </w:p>
+    <w:p>
+      <w:pPr>
+        <w:pStyle w:val="Bibliographie"/>
+        <w:spacing w:line="240" w:lineRule="auto"/>
+        <w:rPr>
+          <w:sz w:val="20"/>
+        </w:rPr>
+      </w:pPr>
+      <w:r>
+        <w:rPr>
+          <w:smallCaps/>
+          <w:sz w:val="20"/>
+        </w:rPr>
+        <w:t>Mallet J-L</w:t>
+      </w:r>
+      <w:r>
+        <w:rPr>
+          <w:sz w:val="20"/>
+        </w:rPr>
+        <w:t xml:space="preserve">. (2014). </w:t>
+      </w:r>
+      <w:r>
+        <w:rPr>
+          <w:i/>
+          <w:iCs/>
+          <w:sz w:val="20"/>
+        </w:rPr>
+        <w:t>Elements of mathematical sedimentary geology: The GeoChron model</w:t>
+      </w:r>
+      <w:r>
+        <w:rPr>
+          <w:sz w:val="20"/>
+        </w:rPr>
+        <w:t>. EAGE publications.</w:t>
+      </w:r>
+    </w:p>
+    <w:p>
+      <w:pPr>
+        <w:pStyle w:val="Bibliographie"/>
+        <w:spacing w:line="240" w:lineRule="auto"/>
+        <w:rPr>
+          <w:sz w:val="20"/>
+        </w:rPr>
+      </w:pPr>
+      <w:r>
+        <w:rPr>
+          <w:smallCaps/>
+          <w:sz w:val="20"/>
+        </w:rPr>
+        <w:t>Perrin M &amp; Rainaud J-F</w:t>
+      </w:r>
+      <w:r>
+        <w:rPr>
+          <w:sz w:val="20"/>
+        </w:rPr>
+        <w:t xml:space="preserve">. (2013). </w:t>
+      </w:r>
+      <w:r>
+        <w:rPr>
+          <w:i/>
+          <w:iCs/>
+          <w:sz w:val="20"/>
+        </w:rPr>
+        <w:t>Shared Earth Modeling: Knowledge Driven Solutions for Building and Managing Subsurface 3D Geological Models</w:t>
+      </w:r>
+      <w:r>
+        <w:rPr>
+          <w:sz w:val="20"/>
+        </w:rPr>
+        <w:t>. Editions Technip.</w:t>
+      </w:r>
+    </w:p>
+    <w:p>
+      <w:pPr>
+        <w:pStyle w:val="Bibliographie"/>
+        <w:spacing w:line="240" w:lineRule="auto"/>
+        <w:rPr>
+          <w:sz w:val="20"/>
+        </w:rPr>
+      </w:pPr>
+      <w:r>
+        <w:rPr>
+          <w:smallCaps/>
+          <w:sz w:val="20"/>
+        </w:rPr>
+        <w:t>Ringrose P &amp; Bentley M</w:t>
+      </w:r>
+      <w:r>
+        <w:rPr>
+          <w:sz w:val="20"/>
+        </w:rPr>
+        <w:t xml:space="preserve">. (2015). </w:t>
+      </w:r>
+      <w:r>
+        <w:rPr>
+          <w:i/>
+          <w:iCs/>
+          <w:sz w:val="20"/>
+        </w:rPr>
         <w:t>Reservoir Model Design</w:t>
       </w:r>
       <w:r>
@@ -3814,6 +4148,7 @@
     <w:p>
       <w:pPr>
         <w:pStyle w:val="Bibliographie"/>
+        <w:spacing w:line="240" w:lineRule="auto"/>
         <w:rPr>
           <w:sz w:val="20"/>
         </w:rPr>
@@ -3872,7 +4207,7 @@
       <w:footerReference w:type="default" r:id="rId10"/>
       <w:footerReference w:type="first" r:id="rId11"/>
       <w:pgSz w:w="11906" w:h="16838" w:code="9"/>
-      <w:pgMar w:top="1699" w:right="1123" w:bottom="1138" w:left="1123" w:header="864" w:footer="562" w:gutter="0"/>
+      <w:pgMar w:top="1418" w:right="1134" w:bottom="851" w:left="1247" w:header="0" w:footer="567" w:gutter="170"/>
       <w:pgNumType w:start="1"/>
       <w:cols w:space="720"/>
       <w:titlePg/>
@@ -3883,7 +4218,7 @@
 </file>
 
 <file path=word/endnotes.xml><?xml version="1.0" encoding="utf-8"?>
-<w:endnotes xmlns:wpc="http://schemas.microsoft.com/office/word/2010/wordprocessingCanvas" xmlns:mc="http://schemas.openxmlformats.org/markup-compatibility/2006" xmlns:o="urn:schemas-microsoft-com:office:office" xmlns:r="http://schemas.openxmlformats.org/officeDocument/2006/relationships" xmlns:m="http://schemas.openxmlformats.org/officeDocument/2006/math" xmlns:v="urn:schemas-microsoft-com:vml" xmlns:wp14="http://schemas.microsoft.com/office/word/2010/wordprocessingDrawing" xmlns:wp="http://schemas.openxmlformats.org/drawingml/2006/wordprocessingDrawing" xmlns:w10="urn:schemas-microsoft-com:office:word" xmlns:w="http://schemas.openxmlformats.org/wordprocessingml/2006/main" xmlns:w14="http://schemas.microsoft.com/office/word/2010/wordml" xmlns:w15="http://schemas.microsoft.com/office/word/2012/wordml" xmlns:wpg="http://schemas.microsoft.com/office/word/2010/wordprocessingGroup" xmlns:wpi="http://schemas.microsoft.com/office/word/2010/wordprocessingInk" xmlns:wne="http://schemas.microsoft.com/office/word/2006/wordml" xmlns:wps="http://schemas.microsoft.com/office/word/2010/wordprocessingShape" mc:Ignorable="w14 w15 wp14">
+<w:endnotes xmlns:wpc="http://schemas.microsoft.com/office/word/2010/wordprocessingCanvas" xmlns:cx="http://schemas.microsoft.com/office/drawing/2014/chartex" xmlns:cx1="http://schemas.microsoft.com/office/drawing/2015/9/8/chartex" xmlns:cx2="http://schemas.microsoft.com/office/drawing/2015/10/21/chartex" xmlns:cx3="http://schemas.microsoft.com/office/drawing/2016/5/9/chartex" xmlns:cx4="http://schemas.microsoft.com/office/drawing/2016/5/10/chartex" xmlns:cx5="http://schemas.microsoft.com/office/drawing/2016/5/11/chartex" xmlns:cx6="http://schemas.microsoft.com/office/drawing/2016/5/12/chartex" xmlns:cx7="http://schemas.microsoft.com/office/drawing/2016/5/13/chartex" xmlns:cx8="http://schemas.microsoft.com/office/drawing/2016/5/14/chartex" xmlns:mc="http://schemas.openxmlformats.org/markup-compatibility/2006" xmlns:aink="http://schemas.microsoft.com/office/drawing/2016/ink" xmlns:am3d="http://schemas.microsoft.com/office/drawing/2017/model3d" xmlns:o="urn:schemas-microsoft-com:office:office" xmlns:oel="http://schemas.microsoft.com/office/2019/extlst" xmlns:r="http://schemas.openxmlformats.org/officeDocument/2006/relationships" xmlns:m="http://schemas.openxmlformats.org/officeDocument/2006/math" xmlns:v="urn:schemas-microsoft-com:vml" xmlns:wp14="http://schemas.microsoft.com/office/word/2010/wordprocessingDrawing" xmlns:wp="http://schemas.openxmlformats.org/drawingml/2006/wordprocessingDrawing" xmlns:w10="urn:schemas-microsoft-com:office:word" xmlns:w="http://schemas.openxmlformats.org/wordprocessingml/2006/main" xmlns:w14="http://schemas.microsoft.com/office/word/2010/wordml" xmlns:w15="http://schemas.microsoft.com/office/word/2012/wordml" xmlns:w16cex="http://schemas.microsoft.com/office/word/2018/wordml/cex" xmlns:w16cid="http://schemas.microsoft.com/office/word/2016/wordml/cid" xmlns:w16="http://schemas.microsoft.com/office/word/2018/wordml" xmlns:w16du="http://schemas.microsoft.com/office/word/2023/wordml/word16du" xmlns:w16sdtdh="http://schemas.microsoft.com/office/word/2020/wordml/sdtdatahash" xmlns:w16sdtfl="http://schemas.microsoft.com/office/word/2024/wordml/sdtformatlock" xmlns:w16se="http://schemas.microsoft.com/office/word/2015/wordml/symex" xmlns:wpg="http://schemas.microsoft.com/office/word/2010/wordprocessingGroup" xmlns:wpi="http://schemas.microsoft.com/office/word/2010/wordprocessingInk" xmlns:wne="http://schemas.microsoft.com/office/word/2006/wordml" xmlns:wps="http://schemas.microsoft.com/office/word/2010/wordprocessingShape" mc:Ignorable="w14 w15 w16se w16cid w16 w16cex w16sdtdh w16sdtfl w16du wp14">
   <w:endnote w:type="separator" w:id="-1">
     <w:p>
       <w:r>
@@ -3902,13 +4237,20 @@
 </file>
 
 <file path=word/footer1.xml><?xml version="1.0" encoding="utf-8"?>
-<w:ftr xmlns:wpc="http://schemas.microsoft.com/office/word/2010/wordprocessingCanvas" xmlns:mc="http://schemas.openxmlformats.org/markup-compatibility/2006" xmlns:o="urn:schemas-microsoft-com:office:office" xmlns:r="http://schemas.openxmlformats.org/officeDocument/2006/relationships" xmlns:m="http://schemas.openxmlformats.org/officeDocument/2006/math" xmlns:v="urn:schemas-microsoft-com:vml" xmlns:wp14="http://schemas.microsoft.com/office/word/2010/wordprocessingDrawing" xmlns:wp="http://schemas.openxmlformats.org/drawingml/2006/wordprocessingDrawing" xmlns:w10="urn:schemas-microsoft-com:office:word" xmlns:w="http://schemas.openxmlformats.org/wordprocessingml/2006/main" xmlns:w14="http://schemas.microsoft.com/office/word/2010/wordml" xmlns:w15="http://schemas.microsoft.com/office/word/2012/wordml" xmlns:wpg="http://schemas.microsoft.com/office/word/2010/wordprocessingGroup" xmlns:wpi="http://schemas.microsoft.com/office/word/2010/wordprocessingInk" xmlns:wne="http://schemas.microsoft.com/office/word/2006/wordml" xmlns:wps="http://schemas.microsoft.com/office/word/2010/wordprocessingShape" mc:Ignorable="w14 w15 wp14">
+<w:ftr xmlns:wpc="http://schemas.microsoft.com/office/word/2010/wordprocessingCanvas" xmlns:cx="http://schemas.microsoft.com/office/drawing/2014/chartex" xmlns:cx1="http://schemas.microsoft.com/office/drawing/2015/9/8/chartex" xmlns:cx2="http://schemas.microsoft.com/office/drawing/2015/10/21/chartex" xmlns:cx3="http://schemas.microsoft.com/office/drawing/2016/5/9/chartex" xmlns:cx4="http://schemas.microsoft.com/office/drawing/2016/5/10/chartex" xmlns:cx5="http://schemas.microsoft.com/office/drawing/2016/5/11/chartex" xmlns:cx6="http://schemas.microsoft.com/office/drawing/2016/5/12/chartex" xmlns:cx7="http://schemas.microsoft.com/office/drawing/2016/5/13/chartex" xmlns:cx8="http://schemas.microsoft.com/office/drawing/2016/5/14/chartex" xmlns:mc="http://schemas.openxmlformats.org/markup-compatibility/2006" xmlns:aink="http://schemas.microsoft.com/office/drawing/2016/ink" xmlns:am3d="http://schemas.microsoft.com/office/drawing/2017/model3d" xmlns:o="urn:schemas-microsoft-com:office:office" xmlns:oel="http://schemas.microsoft.com/office/2019/extlst" xmlns:r="http://schemas.openxmlformats.org/officeDocument/2006/relationships" xmlns:m="http://schemas.openxmlformats.org/officeDocument/2006/math" xmlns:v="urn:schemas-microsoft-com:vml" xmlns:wp14="http://schemas.microsoft.com/office/word/2010/wordprocessingDrawing" xmlns:wp="http://schemas.openxmlformats.org/drawingml/2006/wordprocessingDrawing" xmlns:w10="urn:schemas-microsoft-com:office:word" xmlns:w="http://schemas.openxmlformats.org/wordprocessingml/2006/main" xmlns:w14="http://schemas.microsoft.com/office/word/2010/wordml" xmlns:w15="http://schemas.microsoft.com/office/word/2012/wordml" xmlns:w16cex="http://schemas.microsoft.com/office/word/2018/wordml/cex" xmlns:w16cid="http://schemas.microsoft.com/office/word/2016/wordml/cid" xmlns:w16="http://schemas.microsoft.com/office/word/2018/wordml" xmlns:w16du="http://schemas.microsoft.com/office/word/2023/wordml/word16du" xmlns:w16sdtdh="http://schemas.microsoft.com/office/word/2020/wordml/sdtdatahash" xmlns:w16sdtfl="http://schemas.microsoft.com/office/word/2024/wordml/sdtformatlock" xmlns:w16se="http://schemas.microsoft.com/office/word/2015/wordml/symex" xmlns:wpg="http://schemas.microsoft.com/office/word/2010/wordprocessingGroup" xmlns:wpi="http://schemas.microsoft.com/office/word/2010/wordprocessingInk" xmlns:wne="http://schemas.microsoft.com/office/word/2006/wordml" xmlns:wps="http://schemas.microsoft.com/office/word/2010/wordprocessingShape" mc:Ignorable="w14 w15 w16se w16cid w16 w16cex w16sdtdh w16sdtfl w16du wp14">
   <w:p>
     <w:pPr>
       <w:pStyle w:val="Pieddepage"/>
+      <w:pBdr>
+        <w:top w:val="single" w:sz="4" w:space="1" w:color="auto"/>
+      </w:pBdr>
+      <w:ind w:firstLine="0"/>
     </w:pPr>
     <w:r>
-      <w:t>My (short) Title (less than 40 characters)</w:t>
+      <w:t>Short</w:t>
+    </w:r>
+    <w:r>
+      <w:t xml:space="preserve"> Title (less than 40 characters)</w:t>
     </w:r>
     <w:r>
       <w:tab/>
@@ -3917,6 +4259,7 @@
   <w:p>
     <w:pPr>
       <w:pStyle w:val="Pieddepage"/>
+      <w:ind w:firstLine="0"/>
     </w:pPr>
     <w:r>
       <w:t>My Name et al. (less than 40 characters)</w:t>
@@ -3926,7 +4269,7 @@
 </file>
 
 <file path=word/footer2.xml><?xml version="1.0" encoding="utf-8"?>
-<w:ftr xmlns:wpc="http://schemas.microsoft.com/office/word/2010/wordprocessingCanvas" xmlns:mc="http://schemas.openxmlformats.org/markup-compatibility/2006" xmlns:o="urn:schemas-microsoft-com:office:office" xmlns:r="http://schemas.openxmlformats.org/officeDocument/2006/relationships" xmlns:m="http://schemas.openxmlformats.org/officeDocument/2006/math" xmlns:v="urn:schemas-microsoft-com:vml" xmlns:wp14="http://schemas.microsoft.com/office/word/2010/wordprocessingDrawing" xmlns:wp="http://schemas.openxmlformats.org/drawingml/2006/wordprocessingDrawing" xmlns:w10="urn:schemas-microsoft-com:office:word" xmlns:w="http://schemas.openxmlformats.org/wordprocessingml/2006/main" xmlns:w14="http://schemas.microsoft.com/office/word/2010/wordml" xmlns:w15="http://schemas.microsoft.com/office/word/2012/wordml" xmlns:wpg="http://schemas.microsoft.com/office/word/2010/wordprocessingGroup" xmlns:wpi="http://schemas.microsoft.com/office/word/2010/wordprocessingInk" xmlns:wne="http://schemas.microsoft.com/office/word/2006/wordml" xmlns:wps="http://schemas.microsoft.com/office/word/2010/wordprocessingShape" mc:Ignorable="w14 w15 wp14">
+<w:ftr xmlns:wpc="http://schemas.microsoft.com/office/word/2010/wordprocessingCanvas" xmlns:cx="http://schemas.microsoft.com/office/drawing/2014/chartex" xmlns:cx1="http://schemas.microsoft.com/office/drawing/2015/9/8/chartex" xmlns:cx2="http://schemas.microsoft.com/office/drawing/2015/10/21/chartex" xmlns:cx3="http://schemas.microsoft.com/office/drawing/2016/5/9/chartex" xmlns:cx4="http://schemas.microsoft.com/office/drawing/2016/5/10/chartex" xmlns:cx5="http://schemas.microsoft.com/office/drawing/2016/5/11/chartex" xmlns:cx6="http://schemas.microsoft.com/office/drawing/2016/5/12/chartex" xmlns:cx7="http://schemas.microsoft.com/office/drawing/2016/5/13/chartex" xmlns:cx8="http://schemas.microsoft.com/office/drawing/2016/5/14/chartex" xmlns:mc="http://schemas.openxmlformats.org/markup-compatibility/2006" xmlns:aink="http://schemas.microsoft.com/office/drawing/2016/ink" xmlns:am3d="http://schemas.microsoft.com/office/drawing/2017/model3d" xmlns:o="urn:schemas-microsoft-com:office:office" xmlns:oel="http://schemas.microsoft.com/office/2019/extlst" xmlns:r="http://schemas.openxmlformats.org/officeDocument/2006/relationships" xmlns:m="http://schemas.openxmlformats.org/officeDocument/2006/math" xmlns:v="urn:schemas-microsoft-com:vml" xmlns:wp14="http://schemas.microsoft.com/office/word/2010/wordprocessingDrawing" xmlns:wp="http://schemas.openxmlformats.org/drawingml/2006/wordprocessingDrawing" xmlns:w10="urn:schemas-microsoft-com:office:word" xmlns:w="http://schemas.openxmlformats.org/wordprocessingml/2006/main" xmlns:w14="http://schemas.microsoft.com/office/word/2010/wordml" xmlns:w15="http://schemas.microsoft.com/office/word/2012/wordml" xmlns:w16cex="http://schemas.microsoft.com/office/word/2018/wordml/cex" xmlns:w16cid="http://schemas.microsoft.com/office/word/2016/wordml/cid" xmlns:w16="http://schemas.microsoft.com/office/word/2018/wordml" xmlns:w16du="http://schemas.microsoft.com/office/word/2023/wordml/word16du" xmlns:w16sdtdh="http://schemas.microsoft.com/office/word/2020/wordml/sdtdatahash" xmlns:w16sdtfl="http://schemas.microsoft.com/office/word/2024/wordml/sdtformatlock" xmlns:w16se="http://schemas.microsoft.com/office/word/2015/wordml/symex" xmlns:wpg="http://schemas.microsoft.com/office/word/2010/wordprocessingGroup" xmlns:wpi="http://schemas.microsoft.com/office/word/2010/wordprocessingInk" xmlns:wne="http://schemas.microsoft.com/office/word/2006/wordml" xmlns:wps="http://schemas.microsoft.com/office/word/2010/wordprocessingShape" mc:Ignorable="w14 w15 w16se w16cid w16 w16cex w16sdtdh w16sdtfl w16du wp14">
   <w:p>
     <w:pPr>
       <w:pStyle w:val="Pieddepage"/>
@@ -3937,7 +4280,7 @@
 </file>
 
 <file path=word/footnotes.xml><?xml version="1.0" encoding="utf-8"?>
-<w:footnotes xmlns:wpc="http://schemas.microsoft.com/office/word/2010/wordprocessingCanvas" xmlns:mc="http://schemas.openxmlformats.org/markup-compatibility/2006" xmlns:o="urn:schemas-microsoft-com:office:office" xmlns:r="http://schemas.openxmlformats.org/officeDocument/2006/relationships" xmlns:m="http://schemas.openxmlformats.org/officeDocument/2006/math" xmlns:v="urn:schemas-microsoft-com:vml" xmlns:wp14="http://schemas.microsoft.com/office/word/2010/wordprocessingDrawing" xmlns:wp="http://schemas.openxmlformats.org/drawingml/2006/wordprocessingDrawing" xmlns:w10="urn:schemas-microsoft-com:office:word" xmlns:w="http://schemas.openxmlformats.org/wordprocessingml/2006/main" xmlns:w14="http://schemas.microsoft.com/office/word/2010/wordml" xmlns:w15="http://schemas.microsoft.com/office/word/2012/wordml" xmlns:wpg="http://schemas.microsoft.com/office/word/2010/wordprocessingGroup" xmlns:wpi="http://schemas.microsoft.com/office/word/2010/wordprocessingInk" xmlns:wne="http://schemas.microsoft.com/office/word/2006/wordml" xmlns:wps="http://schemas.microsoft.com/office/word/2010/wordprocessingShape" mc:Ignorable="w14 w15 wp14">
+<w:footnotes xmlns:wpc="http://schemas.microsoft.com/office/word/2010/wordprocessingCanvas" xmlns:cx="http://schemas.microsoft.com/office/drawing/2014/chartex" xmlns:cx1="http://schemas.microsoft.com/office/drawing/2015/9/8/chartex" xmlns:cx2="http://schemas.microsoft.com/office/drawing/2015/10/21/chartex" xmlns:cx3="http://schemas.microsoft.com/office/drawing/2016/5/9/chartex" xmlns:cx4="http://schemas.microsoft.com/office/drawing/2016/5/10/chartex" xmlns:cx5="http://schemas.microsoft.com/office/drawing/2016/5/11/chartex" xmlns:cx6="http://schemas.microsoft.com/office/drawing/2016/5/12/chartex" xmlns:cx7="http://schemas.microsoft.com/office/drawing/2016/5/13/chartex" xmlns:cx8="http://schemas.microsoft.com/office/drawing/2016/5/14/chartex" xmlns:mc="http://schemas.openxmlformats.org/markup-compatibility/2006" xmlns:aink="http://schemas.microsoft.com/office/drawing/2016/ink" xmlns:am3d="http://schemas.microsoft.com/office/drawing/2017/model3d" xmlns:o="urn:schemas-microsoft-com:office:office" xmlns:oel="http://schemas.microsoft.com/office/2019/extlst" xmlns:r="http://schemas.openxmlformats.org/officeDocument/2006/relationships" xmlns:m="http://schemas.openxmlformats.org/officeDocument/2006/math" xmlns:v="urn:schemas-microsoft-com:vml" xmlns:wp14="http://schemas.microsoft.com/office/word/2010/wordprocessingDrawing" xmlns:wp="http://schemas.openxmlformats.org/drawingml/2006/wordprocessingDrawing" xmlns:w10="urn:schemas-microsoft-com:office:word" xmlns:w="http://schemas.openxmlformats.org/wordprocessingml/2006/main" xmlns:w14="http://schemas.microsoft.com/office/word/2010/wordml" xmlns:w15="http://schemas.microsoft.com/office/word/2012/wordml" xmlns:w16cex="http://schemas.microsoft.com/office/word/2018/wordml/cex" xmlns:w16cid="http://schemas.microsoft.com/office/word/2016/wordml/cid" xmlns:w16="http://schemas.microsoft.com/office/word/2018/wordml" xmlns:w16du="http://schemas.microsoft.com/office/word/2023/wordml/word16du" xmlns:w16sdtdh="http://schemas.microsoft.com/office/word/2020/wordml/sdtdatahash" xmlns:w16sdtfl="http://schemas.microsoft.com/office/word/2024/wordml/sdtformatlock" xmlns:w16se="http://schemas.microsoft.com/office/word/2015/wordml/symex" xmlns:wpg="http://schemas.microsoft.com/office/word/2010/wordprocessingGroup" xmlns:wpi="http://schemas.microsoft.com/office/word/2010/wordprocessingInk" xmlns:wne="http://schemas.microsoft.com/office/word/2006/wordml" xmlns:wps="http://schemas.microsoft.com/office/word/2010/wordprocessingShape" mc:Ignorable="w14 w15 w16se w16cid w16 w16cex w16sdtdh w16sdtfl w16du wp14">
   <w:footnote w:type="separator" w:id="-1">
     <w:p>
       <w:r>
@@ -3967,18 +4310,45 @@
         <w:t xml:space="preserve"> </w:t>
       </w:r>
       <w:r>
-        <w:t>It is best to announce sections as above using parentheses in the main text. Finishing the abstract with the outline is, in general, a bad practice because it is redundant with the table of content which is available in most digital papers</w:t>
-      </w:r>
-      <w:r>
-        <w:t>.</w:t>
-      </w:r>
+        <w:t xml:space="preserve">Please reference sections as above using parentheses in the main text, as this is the most compact way to tell the reader about where to find more details on the contributions. The common but bad practice to finish the introduction with a textual outline of the paper should be avoided, as it is redundant with the table of content which is available in most digital papers (J.R. </w:t>
+      </w:r>
+      <w:proofErr w:type="spellStart"/>
+      <w:r>
+        <w:t>Shewchuck</w:t>
+      </w:r>
+      <w:proofErr w:type="spellEnd"/>
+      <w:r>
+        <w:t xml:space="preserve"> lists this as one of </w:t>
+      </w:r>
+      <w:hyperlink r:id="rId1" w:history="1">
+        <w:r>
+          <w:rPr>
+            <w:rStyle w:val="Lienhypertexte"/>
+          </w:rPr>
+          <w:t>the three sins of authors in computer science and mat</w:t>
+        </w:r>
+        <w:r>
+          <w:rPr>
+            <w:rStyle w:val="Lienhypertexte"/>
+          </w:rPr>
+          <w:t>h</w:t>
+        </w:r>
+      </w:hyperlink>
+      <w:r>
+        <w:t>!</w:t>
+      </w:r>
+    </w:p>
+    <w:p>
+      <w:pPr>
+        <w:pStyle w:val="Notedebasdepage"/>
+      </w:pPr>
     </w:p>
   </w:footnote>
 </w:footnotes>
 </file>
 
 <file path=word/numbering.xml><?xml version="1.0" encoding="utf-8"?>
-<w:numbering xmlns:wpc="http://schemas.microsoft.com/office/word/2010/wordprocessingCanvas" xmlns:mc="http://schemas.openxmlformats.org/markup-compatibility/2006" xmlns:o="urn:schemas-microsoft-com:office:office" xmlns:r="http://schemas.openxmlformats.org/officeDocument/2006/relationships" xmlns:m="http://schemas.openxmlformats.org/officeDocument/2006/math" xmlns:v="urn:schemas-microsoft-com:vml" xmlns:wp14="http://schemas.microsoft.com/office/word/2010/wordprocessingDrawing" xmlns:wp="http://schemas.openxmlformats.org/drawingml/2006/wordprocessingDrawing" xmlns:w10="urn:schemas-microsoft-com:office:word" xmlns:w="http://schemas.openxmlformats.org/wordprocessingml/2006/main" xmlns:w14="http://schemas.microsoft.com/office/word/2010/wordml" xmlns:w15="http://schemas.microsoft.com/office/word/2012/wordml" xmlns:wpg="http://schemas.microsoft.com/office/word/2010/wordprocessingGroup" xmlns:wpi="http://schemas.microsoft.com/office/word/2010/wordprocessingInk" xmlns:wne="http://schemas.microsoft.com/office/word/2006/wordml" xmlns:wps="http://schemas.microsoft.com/office/word/2010/wordprocessingShape" mc:Ignorable="w14 w15 wp14">
+<w:numbering xmlns:wpc="http://schemas.microsoft.com/office/word/2010/wordprocessingCanvas" xmlns:cx="http://schemas.microsoft.com/office/drawing/2014/chartex" xmlns:cx1="http://schemas.microsoft.com/office/drawing/2015/9/8/chartex" xmlns:cx2="http://schemas.microsoft.com/office/drawing/2015/10/21/chartex" xmlns:cx3="http://schemas.microsoft.com/office/drawing/2016/5/9/chartex" xmlns:cx4="http://schemas.microsoft.com/office/drawing/2016/5/10/chartex" xmlns:cx5="http://schemas.microsoft.com/office/drawing/2016/5/11/chartex" xmlns:cx6="http://schemas.microsoft.com/office/drawing/2016/5/12/chartex" xmlns:cx7="http://schemas.microsoft.com/office/drawing/2016/5/13/chartex" xmlns:cx8="http://schemas.microsoft.com/office/drawing/2016/5/14/chartex" xmlns:mc="http://schemas.openxmlformats.org/markup-compatibility/2006" xmlns:aink="http://schemas.microsoft.com/office/drawing/2016/ink" xmlns:am3d="http://schemas.microsoft.com/office/drawing/2017/model3d" xmlns:o="urn:schemas-microsoft-com:office:office" xmlns:oel="http://schemas.microsoft.com/office/2019/extlst" xmlns:r="http://schemas.openxmlformats.org/officeDocument/2006/relationships" xmlns:m="http://schemas.openxmlformats.org/officeDocument/2006/math" xmlns:v="urn:schemas-microsoft-com:vml" xmlns:wp14="http://schemas.microsoft.com/office/word/2010/wordprocessingDrawing" xmlns:wp="http://schemas.openxmlformats.org/drawingml/2006/wordprocessingDrawing" xmlns:w10="urn:schemas-microsoft-com:office:word" xmlns:w="http://schemas.openxmlformats.org/wordprocessingml/2006/main" xmlns:w14="http://schemas.microsoft.com/office/word/2010/wordml" xmlns:w15="http://schemas.microsoft.com/office/word/2012/wordml" xmlns:w16cex="http://schemas.microsoft.com/office/word/2018/wordml/cex" xmlns:w16cid="http://schemas.microsoft.com/office/word/2016/wordml/cid" xmlns:w16="http://schemas.microsoft.com/office/word/2018/wordml" xmlns:w16du="http://schemas.microsoft.com/office/word/2023/wordml/word16du" xmlns:w16sdtdh="http://schemas.microsoft.com/office/word/2020/wordml/sdtdatahash" xmlns:w16sdtfl="http://schemas.microsoft.com/office/word/2024/wordml/sdtformatlock" xmlns:w16se="http://schemas.microsoft.com/office/word/2015/wordml/symex" xmlns:wpg="http://schemas.microsoft.com/office/word/2010/wordprocessingGroup" xmlns:wpi="http://schemas.microsoft.com/office/word/2010/wordprocessingInk" xmlns:wne="http://schemas.microsoft.com/office/word/2006/wordml" xmlns:wps="http://schemas.microsoft.com/office/word/2010/wordprocessingShape" mc:Ignorable="w14 w15 w16se w16cid w16 w16cex w16sdtdh w16sdtfl w16du wp14">
   <w:abstractNum w:abstractNumId="0" w15:restartNumberingAfterBreak="0">
     <w:nsid w:val="00000001"/>
     <w:multiLevelType w:val="multilevel"/>
@@ -4260,17 +4630,17 @@
       </w:rPr>
     </w:lvl>
   </w:abstractNum>
-  <w:num w:numId="1">
+  <w:num w:numId="1" w16cid:durableId="1485077821">
     <w:abstractNumId w:val="0"/>
   </w:num>
-  <w:num w:numId="2">
+  <w:num w:numId="2" w16cid:durableId="965281254">
     <w:abstractNumId w:val="1"/>
   </w:num>
 </w:numbering>
 </file>
 
 <file path=word/styles.xml><?xml version="1.0" encoding="utf-8"?>
-<w:styles xmlns:mc="http://schemas.openxmlformats.org/markup-compatibility/2006" xmlns:r="http://schemas.openxmlformats.org/officeDocument/2006/relationships" xmlns:w="http://schemas.openxmlformats.org/wordprocessingml/2006/main" xmlns:w14="http://schemas.microsoft.com/office/word/2010/wordml" xmlns:w15="http://schemas.microsoft.com/office/word/2012/wordml" mc:Ignorable="w14 w15">
+<w:styles xmlns:mc="http://schemas.openxmlformats.org/markup-compatibility/2006" xmlns:r="http://schemas.openxmlformats.org/officeDocument/2006/relationships" xmlns:w="http://schemas.openxmlformats.org/wordprocessingml/2006/main" xmlns:w14="http://schemas.microsoft.com/office/word/2010/wordml" xmlns:w15="http://schemas.microsoft.com/office/word/2012/wordml" xmlns:w16cex="http://schemas.microsoft.com/office/word/2018/wordml/cex" xmlns:w16cid="http://schemas.microsoft.com/office/word/2016/wordml/cid" xmlns:w16="http://schemas.microsoft.com/office/word/2018/wordml" xmlns:w16du="http://schemas.microsoft.com/office/word/2023/wordml/word16du" xmlns:w16sdtdh="http://schemas.microsoft.com/office/word/2020/wordml/sdtdatahash" xmlns:w16sdtfl="http://schemas.microsoft.com/office/word/2024/wordml/sdtformatlock" xmlns:w16se="http://schemas.microsoft.com/office/word/2015/wordml/symex" mc:Ignorable="w14 w15 w16se w16cid w16 w16cex w16sdtdh w16sdtfl w16du">
   <w:docDefaults>
     <w:rPrDefault>
       <w:rPr>
@@ -4280,7 +4650,7 @@
     </w:rPrDefault>
     <w:pPrDefault/>
   </w:docDefaults>
-  <w:latentStyles w:defLockedState="0" w:defUIPriority="99" w:defSemiHidden="0" w:defUnhideWhenUsed="0" w:defQFormat="0" w:count="371">
+  <w:latentStyles w:defLockedState="0" w:defUIPriority="99" w:defSemiHidden="0" w:defUnhideWhenUsed="0" w:defQFormat="0" w:count="376">
     <w:lsdException w:name="Normal" w:uiPriority="0" w:qFormat="1"/>
     <w:lsdException w:name="heading 1" w:uiPriority="9" w:qFormat="1"/>
     <w:lsdException w:name="heading 2" w:uiPriority="9" w:qFormat="1"/>
@@ -4652,6 +5022,11 @@
     <w:lsdException w:name="List Table 5 Dark Accent 6" w:uiPriority="50"/>
     <w:lsdException w:name="List Table 6 Colorful Accent 6" w:uiPriority="51"/>
     <w:lsdException w:name="List Table 7 Colorful Accent 6" w:uiPriority="52"/>
+    <w:lsdException w:name="Mention" w:semiHidden="1" w:unhideWhenUsed="1"/>
+    <w:lsdException w:name="Smart Hyperlink" w:semiHidden="1" w:unhideWhenUsed="1"/>
+    <w:lsdException w:name="Hashtag" w:semiHidden="1" w:unhideWhenUsed="1"/>
+    <w:lsdException w:name="Unresolved Mention" w:semiHidden="1" w:unhideWhenUsed="1"/>
+    <w:lsdException w:name="Smart Link" w:semiHidden="1" w:unhideWhenUsed="1"/>
   </w:latentStyles>
   <w:style w:type="paragraph" w:default="1" w:styleId="Normal">
     <w:name w:val="Normal"/>
@@ -4695,9 +5070,11 @@
     <w:aliases w:val="RING SubSection"/>
     <w:basedOn w:val="GocadSubsection"/>
     <w:next w:val="Normal"/>
+    <w:link w:val="Titre2Car"/>
     <w:qFormat/>
-    <w:rsid w:val="0066480C"/>
+    <w:rsid w:val="00ED6B52"/>
     <w:pPr>
+      <w:keepNext/>
       <w:numPr>
         <w:ilvl w:val="1"/>
       </w:numPr>
@@ -4827,7 +5204,6 @@
   <w:style w:type="character" w:default="1" w:styleId="Policepardfaut">
     <w:name w:val="Default Paragraph Font"/>
     <w:uiPriority w:val="1"/>
-    <w:semiHidden/>
     <w:unhideWhenUsed/>
   </w:style>
   <w:style w:type="table" w:default="1" w:styleId="TableauNormal">
@@ -5352,14 +5728,17 @@
     <w:link w:val="TitreCar"/>
     <w:uiPriority w:val="10"/>
     <w:qFormat/>
-    <w:rsid w:val="00812B20"/>
+    <w:rsid w:val="00342097"/>
+    <w:pPr>
+      <w:spacing w:before="360"/>
+    </w:pPr>
   </w:style>
   <w:style w:type="character" w:customStyle="1" w:styleId="TitreCar">
     <w:name w:val="Titre Car"/>
     <w:aliases w:val="RINGTitle Car"/>
     <w:link w:val="Titre"/>
     <w:uiPriority w:val="10"/>
-    <w:rsid w:val="00812B20"/>
+    <w:rsid w:val="00342097"/>
     <w:rPr>
       <w:b/>
       <w:sz w:val="28"/>
@@ -5439,8 +5818,9 @@
     <w:basedOn w:val="Titre1"/>
     <w:link w:val="RINGSectionUCar"/>
     <w:qFormat/>
-    <w:rsid w:val="0066480C"/>
+    <w:rsid w:val="00FC4E81"/>
     <w:pPr>
+      <w:keepNext/>
       <w:numPr>
         <w:numId w:val="0"/>
       </w:numPr>
@@ -5464,7 +5844,7 @@
     <w:name w:val="RING SectionU Car"/>
     <w:basedOn w:val="Titre1Car"/>
     <w:link w:val="RINGSectionU"/>
-    <w:rsid w:val="0066480C"/>
+    <w:rsid w:val="00FC4E81"/>
     <w:rPr>
       <w:b/>
       <w:sz w:val="28"/>
@@ -5672,6 +6052,30 @@
     <w:rsid w:val="00AF23BF"/>
     <w:rPr>
       <w:vertAlign w:val="superscript"/>
+    </w:rPr>
+  </w:style>
+  <w:style w:type="character" w:customStyle="1" w:styleId="Titre2Car">
+    <w:name w:val="Titre 2 Car"/>
+    <w:aliases w:val="RING SubSection Car"/>
+    <w:basedOn w:val="Policepardfaut"/>
+    <w:link w:val="Titre2"/>
+    <w:rsid w:val="00ED6B52"/>
+    <w:rPr>
+      <w:b/>
+      <w:sz w:val="24"/>
+      <w:lang w:val="en-US" w:eastAsia="zh-CN"/>
+    </w:rPr>
+  </w:style>
+  <w:style w:type="character" w:styleId="Mentionnonrsolue">
+    <w:name w:val="Unresolved Mention"/>
+    <w:basedOn w:val="Policepardfaut"/>
+    <w:uiPriority w:val="99"/>
+    <w:semiHidden/>
+    <w:unhideWhenUsed/>
+    <w:rsid w:val="00B522BB"/>
+    <w:rPr>
+      <w:color w:val="605E5C"/>
+      <w:shd w:val="clear" w:color="auto" w:fill="E1DFDD"/>
     </w:rPr>
   </w:style>
 </w:styles>

</xml_diff>